<commit_message>
Digram UML z PlantUML + dopis o tym w karcie
</commit_message>
<xml_diff>
--- a/Karta_projektu.docx
+++ b/Karta_projektu.docx
@@ -307,29 +307,7 @@
                 <w:szCs w:val="22"/>
                 <w:lang w:val="pl-PL" w:eastAsia="en-US" w:bidi="ar-SA"/>
               </w:rPr>
-              <w:t>Instytut Nauk In</w:t>
-            </w:r>
-            <w:r>
-              <w:rPr>
-                <w:rFonts w:eastAsia="Calibri" w:cs=""/>
-                <w:i/>
-                <w:kern w:val="0"/>
-                <w:sz w:val="22"/>
-                <w:szCs w:val="22"/>
-                <w:lang w:val="pl-PL" w:eastAsia="en-US" w:bidi="ar-SA"/>
-              </w:rPr>
-              <w:t>ż</w:t>
-            </w:r>
-            <w:r>
-              <w:rPr>
-                <w:rFonts w:eastAsia="Calibri" w:cs=""/>
-                <w:i/>
-                <w:kern w:val="0"/>
-                <w:sz w:val="22"/>
-                <w:szCs w:val="22"/>
-                <w:lang w:val="pl-PL" w:eastAsia="en-US" w:bidi="ar-SA"/>
-              </w:rPr>
-              <w:t>ynieryjno-Technicznych</w:t>
+              <w:t>Instytut Nauk Inżynieryjno-Technicznych</w:t>
             </w:r>
           </w:p>
         </w:tc>
@@ -477,18 +455,7 @@
                 <w:szCs w:val="22"/>
                 <w:lang w:val="pl-PL" w:eastAsia="en-US" w:bidi="ar-SA"/>
               </w:rPr>
-              <w:t xml:space="preserve">Rok III, semestr </w:t>
-            </w:r>
-            <w:r>
-              <w:rPr>
-                <w:rFonts w:eastAsia="Calibri" w:cs=""/>
-                <w:i/>
-                <w:kern w:val="0"/>
-                <w:sz w:val="22"/>
-                <w:szCs w:val="22"/>
-                <w:lang w:val="pl-PL" w:eastAsia="en-US" w:bidi="ar-SA"/>
-              </w:rPr>
-              <w:t>letni</w:t>
+              <w:t>Rok III, semestr letni</w:t>
             </w:r>
           </w:p>
         </w:tc>
@@ -1021,62 +988,29 @@
                 <w:szCs w:val="22"/>
                 <w:lang w:val="pl-PL" w:eastAsia="en-US" w:bidi="ar-SA"/>
               </w:rPr>
-              <w:t xml:space="preserve">GanttProject, IntelliJ IDEA, Visual Studio Code, Docker, XAMPP, EasyEDA, Student Docs LaTeX Template System, Android Studio, Arduino IDE, </w:t>
-            </w:r>
-            <w:r>
-              <w:rPr>
-                <w:rFonts w:eastAsia="Calibri" w:cs=""/>
-                <w:i/>
-                <w:kern w:val="0"/>
-                <w:sz w:val="22"/>
-                <w:szCs w:val="22"/>
-                <w:lang w:val="pl-PL" w:eastAsia="en-US" w:bidi="ar-SA"/>
-              </w:rPr>
-              <w:t xml:space="preserve">GitHub, </w:t>
-            </w:r>
-            <w:r>
-              <w:rPr>
-                <w:rFonts w:eastAsia="Calibri" w:cs=""/>
-                <w:i/>
-                <w:kern w:val="0"/>
-                <w:sz w:val="22"/>
-                <w:szCs w:val="22"/>
-                <w:lang w:val="pl-PL" w:eastAsia="en-US" w:bidi="ar-SA"/>
-              </w:rPr>
-              <w:t xml:space="preserve">ESP32, DHT11, Komputer PC, </w:t>
-            </w:r>
-            <w:r>
-              <w:rPr>
-                <w:rFonts w:eastAsia="Calibri" w:cs=""/>
-                <w:i/>
-                <w:kern w:val="0"/>
-                <w:sz w:val="22"/>
-                <w:szCs w:val="22"/>
-                <w:lang w:val="pl-PL" w:eastAsia="en-US" w:bidi="ar-SA"/>
-              </w:rPr>
-              <w:t>Laptop,</w:t>
-            </w:r>
-            <w:r>
-              <w:rPr>
-                <w:rFonts w:eastAsia="Calibri" w:cs=""/>
-                <w:i/>
-                <w:kern w:val="0"/>
-                <w:sz w:val="22"/>
-                <w:szCs w:val="22"/>
-                <w:lang w:val="pl-PL" w:eastAsia="en-US" w:bidi="ar-SA"/>
-              </w:rPr>
-              <w:t xml:space="preserve"> Smartfo</w:t>
-            </w:r>
-            <w:r>
-              <w:rPr>
-                <w:rFonts w:eastAsia="Calibri" w:cs=""/>
-                <w:i/>
-                <w:kern w:val="0"/>
-                <w:sz w:val="22"/>
-                <w:szCs w:val="22"/>
-                <w:lang w:val="pl-PL" w:eastAsia="en-US" w:bidi="ar-SA"/>
-              </w:rPr>
-              <w:t>n</w:t>
+              <w:t xml:space="preserve">GanttProject, IntelliJ IDEA, Visual Studio Code, Docker, XAMPP, EasyEDA, Student Docs LaTeX Template System, Android Studio, Arduino IDE, GitHub, </w:t>
+            </w:r>
+            <w:r>
+              <w:rPr>
+                <w:rFonts w:eastAsia="Calibri" w:cs=""/>
+                <w:i/>
+                <w:kern w:val="0"/>
+                <w:sz w:val="22"/>
+                <w:szCs w:val="22"/>
+                <w:lang w:val="pl-PL" w:eastAsia="en-US" w:bidi="ar-SA"/>
+              </w:rPr>
+              <w:t xml:space="preserve">PlantUML, </w:t>
+            </w:r>
+            <w:r>
+              <w:rPr>
+                <w:rFonts w:eastAsia="Calibri" w:cs=""/>
+                <w:i/>
+                <w:kern w:val="0"/>
+                <w:sz w:val="22"/>
+                <w:szCs w:val="22"/>
+                <w:lang w:val="pl-PL" w:eastAsia="en-US" w:bidi="ar-SA"/>
+              </w:rPr>
+              <w:t>ESP32, DHT11, Komputer PC, Laptop, Smartfon</w:t>
             </w:r>
           </w:p>
         </w:tc>
@@ -1330,29 +1264,7 @@
                 <w:szCs w:val="22"/>
                 <w:lang w:val="pl-PL" w:eastAsia="en-US" w:bidi="ar-SA"/>
               </w:rPr>
-              <w:t>Konfiguracja komunikacji sieciowej między mikrokontroler</w:t>
-            </w:r>
-            <w:r>
-              <w:rPr>
-                <w:rFonts w:eastAsia="Calibri" w:cs=""/>
-                <w:i/>
-                <w:kern w:val="0"/>
-                <w:sz w:val="22"/>
-                <w:szCs w:val="22"/>
-                <w:lang w:val="pl-PL" w:eastAsia="en-US" w:bidi="ar-SA"/>
-              </w:rPr>
-              <w:t>em</w:t>
-            </w:r>
-            <w:r>
-              <w:rPr>
-                <w:rFonts w:eastAsia="Calibri" w:cs=""/>
-                <w:i/>
-                <w:kern w:val="0"/>
-                <w:sz w:val="22"/>
-                <w:szCs w:val="22"/>
-                <w:lang w:val="pl-PL" w:eastAsia="en-US" w:bidi="ar-SA"/>
-              </w:rPr>
-              <w:t xml:space="preserve"> ESP32 a lokalnym serwerem, mapowanie portów w środowisku Docker.</w:t>
+              <w:t>Konfiguracja komunikacji sieciowej między mikrokontrolerem ESP32 a lokalnym serwerem, mapowanie portów w środowisku Docker.</w:t>
             </w:r>
           </w:p>
         </w:tc>
@@ -1415,18 +1327,7 @@
                 <w:szCs w:val="22"/>
                 <w:lang w:val="pl-PL" w:eastAsia="en-US" w:bidi="ar-SA"/>
               </w:rPr>
-              <w:t xml:space="preserve">Problemy z polityką CORS podczas łączenia aplikacji webowej z API, parsowanie formatów daty i godziny między bazą danych a aplikacją mobilną, </w:t>
-            </w:r>
-            <w:r>
-              <w:rPr>
-                <w:rFonts w:eastAsia="Calibri" w:cs=""/>
-                <w:i/>
-                <w:kern w:val="0"/>
-                <w:sz w:val="22"/>
-                <w:szCs w:val="22"/>
-                <w:lang w:val="pl-PL" w:eastAsia="en-US" w:bidi="ar-SA"/>
-              </w:rPr>
-              <w:t>niepoprawna godzina na płytce PCB oraz bardzo długi czas uploadu kodu na nią.</w:t>
+              <w:t>Problemy z polityką CORS podczas łączenia aplikacji webowej z API, parsowanie formatów daty i godziny między bazą danych a aplikacją mobilną, niepoprawna godzina na płytce PCB oraz bardzo długi czas uploadu kodu na nią.</w:t>
             </w:r>
           </w:p>
         </w:tc>
@@ -1528,18 +1429,6 @@
               </w:rPr>
               <w:t>Franciszek Dębski</w:t>
             </w:r>
-            <w:r>
-              <w:rPr>
-                <w:rFonts w:eastAsia="Calibri" w:cs=""/>
-                <w:b/>
-                <w:i/>
-                <w:kern w:val="0"/>
-                <w:sz w:val="22"/>
-                <w:szCs w:val="22"/>
-                <w:lang w:val="pl-PL" w:eastAsia="en-US" w:bidi="ar-SA"/>
-              </w:rPr>
-              <w:t xml:space="preserve">  </w:t>
-            </w:r>
           </w:p>
         </w:tc>
       </w:tr>
@@ -1687,18 +1576,7 @@
                 <w:szCs w:val="22"/>
                 <w:lang w:val="pl-PL" w:eastAsia="en-US" w:bidi="ar-SA"/>
               </w:rPr>
-              <w:t xml:space="preserve">Zaprogramowanie mikrokontrolera ESP32 w języku C++, opracowanie modelu PCB płytki w EasyEDA, </w:t>
-            </w:r>
-            <w:r>
-              <w:rPr>
-                <w:rFonts w:eastAsia="Calibri" w:cs=""/>
-                <w:i/>
-                <w:kern w:val="0"/>
-                <w:sz w:val="22"/>
-                <w:szCs w:val="22"/>
-                <w:lang w:val="pl-PL" w:eastAsia="en-US" w:bidi="ar-SA"/>
-              </w:rPr>
-              <w:t>opracowanie diagramu UML.</w:t>
+              <w:t>Zaprogramowanie mikrokontrolera ESP32 w języku C++, opracowanie modelu PCB płytki w EasyEDA, opracowanie diagramu UML.</w:t>
             </w:r>
           </w:p>
         </w:tc>
@@ -1794,7 +1672,7 @@
                 <w:szCs w:val="22"/>
                 <w:lang w:val="pl-PL" w:eastAsia="en-US" w:bidi="ar-SA"/>
               </w:rPr>
-              <w:t xml:space="preserve">Uwagi </w:t>
+              <w:t>Uwagi</w:t>
             </w:r>
           </w:p>
           <w:p>
@@ -1969,18 +1847,6 @@
                 <w:lang w:val="pl-PL" w:eastAsia="en-US" w:bidi="ar-SA"/>
               </w:rPr>
               <w:t>Patryk Wilk</w:t>
-            </w:r>
-            <w:r>
-              <w:rPr>
-                <w:rFonts w:eastAsia="Calibri" w:cs=""/>
-                <w:b/>
-                <w:i/>
-                <w:kern w:val="0"/>
-                <w:sz w:val="22"/>
-                <w:szCs w:val="22"/>
-                <w:lang w:val="pl-PL" w:eastAsia="en-US" w:bidi="ar-SA"/>
-              </w:rPr>
-              <w:t xml:space="preserve">  </w:t>
             </w:r>
           </w:p>
         </w:tc>
@@ -2227,7 +2093,7 @@
                 <w:szCs w:val="22"/>
                 <w:lang w:val="pl-PL" w:eastAsia="en-US" w:bidi="ar-SA"/>
               </w:rPr>
-              <w:t xml:space="preserve">Uwagi </w:t>
+              <w:t>Uwagi</w:t>
             </w:r>
           </w:p>
           <w:p>
@@ -2370,17 +2236,7 @@
                 <w:szCs w:val="22"/>
                 <w:lang w:val="pl-PL" w:eastAsia="en-US" w:bidi="ar-SA"/>
               </w:rPr>
-              <w:t xml:space="preserve">Zarządzanie harmonogramem w GanttProject, </w:t>
-            </w:r>
-            <w:r>
-              <w:rPr>
-                <w:rFonts w:eastAsia="Calibri" w:cs=""/>
-                <w:kern w:val="0"/>
-                <w:sz w:val="22"/>
-                <w:szCs w:val="22"/>
-                <w:lang w:val="pl-PL" w:eastAsia="en-US" w:bidi="ar-SA"/>
-              </w:rPr>
-              <w:t>pomoc przy programowaniu płytki PCB i tworzeniu kodu aplikacji mobilnej.</w:t>
+              <w:t>Zarządzanie harmonogramem w GanttProject, pomoc przy programowaniu płytki PCB i tworzeniu kodu aplikacji mobilnej.</w:t>
             </w:r>
           </w:p>
         </w:tc>
@@ -2662,7 +2518,7 @@
                 <w:szCs w:val="22"/>
                 <w:lang w:val="pl-PL" w:eastAsia="en-US" w:bidi="ar-SA"/>
               </w:rPr>
-              <w:t xml:space="preserve">Uwagi </w:t>
+              <w:t>Uwagi</w:t>
             </w:r>
           </w:p>
           <w:p>
@@ -2843,18 +2699,6 @@
               </w:rPr>
               <w:t>Kolega co powtarza rok?</w:t>
             </w:r>
-            <w:r>
-              <w:rPr>
-                <w:rFonts w:eastAsia="Calibri" w:cs=""/>
-                <w:b/>
-                <w:i/>
-                <w:kern w:val="0"/>
-                <w:sz w:val="22"/>
-                <w:szCs w:val="22"/>
-                <w:lang w:val="pl-PL" w:eastAsia="en-US" w:bidi="ar-SA"/>
-              </w:rPr>
-              <w:t xml:space="preserve">  </w:t>
-            </w:r>
           </w:p>
         </w:tc>
       </w:tr>
@@ -3081,7 +2925,7 @@
                 <w:szCs w:val="22"/>
                 <w:lang w:val="pl-PL" w:eastAsia="en-US" w:bidi="ar-SA"/>
               </w:rPr>
-              <w:t xml:space="preserve">Uwagi </w:t>
+              <w:t>Uwagi</w:t>
             </w:r>
           </w:p>
           <w:p>
@@ -3348,7 +3192,7 @@
             <w:szCs w:val="24"/>
             <w:bCs/>
           </w:rPr>
-          <w:t>1</w:t>
+          <w:t>2</w:t>
         </w:r>
         <w:r>
           <w:rPr>
@@ -3480,7 +3324,7 @@
             <w:szCs w:val="24"/>
             <w:bCs/>
           </w:rPr>
-          <w:t>1</w:t>
+          <w:t>2</w:t>
         </w:r>
         <w:r>
           <w:rPr>
@@ -4021,6 +3865,23 @@
       <w:lang w:val="pl-PL" w:eastAsia="en-US" w:bidi="ar-SA"/>
     </w:rPr>
   </w:style>
+  <w:style w:type="paragraph" w:styleId="Heading1">
+    <w:name w:val="Heading 1"/>
+    <w:basedOn w:val="Nagwek"/>
+    <w:next w:val="BodyText"/>
+    <w:qFormat/>
+    <w:pPr>
+      <w:spacing w:before="240" w:after="120"/>
+      <w:outlineLvl w:val="0"/>
+    </w:pPr>
+    <w:rPr>
+      <w:rFonts w:ascii="Liberation Serif" w:hAnsi="Liberation Serif" w:eastAsia="Segoe UI" w:cs="Tahoma"/>
+      <w:b/>
+      <w:bCs/>
+      <w:sz w:val="48"/>
+      <w:szCs w:val="48"/>
+    </w:rPr>
+  </w:style>
   <w:style w:type="character" w:styleId="DefaultParagraphFont" w:default="1">
     <w:name w:val="Default Paragraph Font"/>
     <w:uiPriority w:val="1"/>

</xml_diff>

<commit_message>
dopisek i wywalenie tego co powtarza
Dopisałem sobie że zrobiłem rysunek ze schematem połączeń (nie PCB) i wywaliłem tego co powtarza bo to nie ten projekt
</commit_message>
<xml_diff>
--- a/Karta_projektu.docx
+++ b/Karta_projektu.docx
@@ -1,6 +1,6 @@
 
 <file path=word/document.xml><?xml version="1.0" encoding="utf-8"?>
-<w:document xmlns:o="urn:schemas-microsoft-com:office:office" xmlns:r="http://schemas.openxmlformats.org/officeDocument/2006/relationships" xmlns:v="urn:schemas-microsoft-com:vml" xmlns:w="http://schemas.openxmlformats.org/wordprocessingml/2006/main" xmlns:w10="urn:schemas-microsoft-com:office:word" xmlns:wp="http://schemas.openxmlformats.org/drawingml/2006/wordprocessingDrawing" xmlns:wps="http://schemas.microsoft.com/office/word/2010/wordprocessingShape" xmlns:wpg="http://schemas.microsoft.com/office/word/2010/wordprocessingGroup" xmlns:mc="http://schemas.openxmlformats.org/markup-compatibility/2006" xmlns:wp14="http://schemas.microsoft.com/office/word/2010/wordprocessingDrawing" xmlns:w14="http://schemas.microsoft.com/office/word/2010/wordml" xmlns:w15="http://schemas.microsoft.com/office/word/2012/wordml" mc:Ignorable="w14 wp14 w15">
+<w:document xmlns:o="urn:schemas-microsoft-com:office:office" xmlns:r="http://schemas.openxmlformats.org/officeDocument/2006/relationships" xmlns:v="urn:schemas-microsoft-com:vml" xmlns:w="http://schemas.openxmlformats.org/wordprocessingml/2006/main" xmlns:w10="urn:schemas-microsoft-com:office:word" xmlns:wp="http://schemas.openxmlformats.org/drawingml/2006/wordprocessingDrawing" xmlns:pic="http://schemas.openxmlformats.org/drawingml/2006/picture" xmlns:wps="http://schemas.microsoft.com/office/word/2010/wordprocessingShape" xmlns:wpg="http://schemas.microsoft.com/office/word/2010/wordprocessingGroup" xmlns:mc="http://schemas.openxmlformats.org/markup-compatibility/2006" xmlns:wp14="http://schemas.microsoft.com/office/word/2010/wordprocessingDrawing" xmlns:w14="http://schemas.microsoft.com/office/word/2010/wordml" xmlns:w15="http://schemas.microsoft.com/office/word/2012/wordml" mc:Ignorable="w14 wp14 w15">
   <w:body>
     <w:p>
       <w:pPr>
@@ -32,11 +32,11 @@
           <w:bottom w:w="0" w:type="dxa"/>
           <w:right w:w="108" w:type="dxa"/>
         </w:tblCellMar>
-        <w:tblLook w:firstRow="1" w:noVBand="1" w:lastRow="0" w:firstColumn="1" w:lastColumn="0" w:noHBand="0" w:val="04a0"/>
+        <w:tblLook w:val="04a0" w:firstRow="1" w:noVBand="1" w:lastRow="0" w:firstColumn="1" w:lastColumn="0" w:noHBand="0"/>
       </w:tblPr>
       <w:tblGrid>
         <w:gridCol w:w="2972"/>
-        <w:gridCol w:w="6089"/>
+        <w:gridCol w:w="6090"/>
       </w:tblGrid>
       <w:tr>
         <w:trPr/>
@@ -98,18 +98,17 @@
         </w:tc>
         <w:tc>
           <w:tcPr>
-            <w:tcW w:w="6089" w:type="dxa"/>
-            <w:tcBorders/>
-          </w:tcPr>
-          <w:p>
-            <w:pPr>
-              <w:pStyle w:val="Normal"/>
-              <w:widowControl/>
-              <w:suppressAutoHyphens w:val="true"/>
-              <w:spacing w:lineRule="auto" w:line="240" w:before="0" w:after="0"/>
-              <w:jc w:val="left"/>
-              <w:rPr>
-                <w:i/>
+            <w:tcW w:w="6090" w:type="dxa"/>
+            <w:tcBorders/>
+          </w:tcPr>
+          <w:p>
+            <w:pPr>
+              <w:pStyle w:val="Normal"/>
+              <w:widowControl/>
+              <w:suppressAutoHyphens w:val="true"/>
+              <w:spacing w:lineRule="auto" w:line="240" w:before="0" w:after="0"/>
+              <w:jc w:val="left"/>
+              <w:rPr>
                 <w:i/>
               </w:rPr>
             </w:pPr>
@@ -198,18 +197,17 @@
         </w:tc>
         <w:tc>
           <w:tcPr>
-            <w:tcW w:w="6089" w:type="dxa"/>
-            <w:tcBorders/>
-          </w:tcPr>
-          <w:p>
-            <w:pPr>
-              <w:pStyle w:val="Normal"/>
-              <w:widowControl/>
-              <w:suppressAutoHyphens w:val="true"/>
-              <w:spacing w:lineRule="auto" w:line="240" w:before="0" w:after="0"/>
-              <w:jc w:val="left"/>
-              <w:rPr>
-                <w:i/>
+            <w:tcW w:w="6090" w:type="dxa"/>
+            <w:tcBorders/>
+          </w:tcPr>
+          <w:p>
+            <w:pPr>
+              <w:pStyle w:val="Normal"/>
+              <w:widowControl/>
+              <w:suppressAutoHyphens w:val="true"/>
+              <w:spacing w:lineRule="auto" w:line="240" w:before="0" w:after="0"/>
+              <w:jc w:val="left"/>
+              <w:rPr>
                 <w:i/>
               </w:rPr>
             </w:pPr>
@@ -272,18 +270,17 @@
         </w:tc>
         <w:tc>
           <w:tcPr>
-            <w:tcW w:w="6089" w:type="dxa"/>
-            <w:tcBorders/>
-          </w:tcPr>
-          <w:p>
-            <w:pPr>
-              <w:pStyle w:val="Normal"/>
-              <w:widowControl/>
-              <w:suppressAutoHyphens w:val="true"/>
-              <w:spacing w:lineRule="auto" w:line="240" w:before="0" w:after="0"/>
-              <w:jc w:val="left"/>
-              <w:rPr>
-                <w:i/>
+            <w:tcW w:w="6090" w:type="dxa"/>
+            <w:tcBorders/>
+          </w:tcPr>
+          <w:p>
+            <w:pPr>
+              <w:pStyle w:val="Normal"/>
+              <w:widowControl/>
+              <w:suppressAutoHyphens w:val="true"/>
+              <w:spacing w:lineRule="auto" w:line="240" w:before="0" w:after="0"/>
+              <w:jc w:val="left"/>
+              <w:rPr>
                 <w:i/>
               </w:rPr>
             </w:pPr>
@@ -346,18 +343,17 @@
         </w:tc>
         <w:tc>
           <w:tcPr>
-            <w:tcW w:w="6089" w:type="dxa"/>
-            <w:tcBorders/>
-          </w:tcPr>
-          <w:p>
-            <w:pPr>
-              <w:pStyle w:val="Normal"/>
-              <w:widowControl/>
-              <w:suppressAutoHyphens w:val="true"/>
-              <w:spacing w:lineRule="auto" w:line="240" w:before="0" w:after="0"/>
-              <w:jc w:val="left"/>
-              <w:rPr>
-                <w:i/>
+            <w:tcW w:w="6090" w:type="dxa"/>
+            <w:tcBorders/>
+          </w:tcPr>
+          <w:p>
+            <w:pPr>
+              <w:pStyle w:val="Normal"/>
+              <w:widowControl/>
+              <w:suppressAutoHyphens w:val="true"/>
+              <w:spacing w:lineRule="auto" w:line="240" w:before="0" w:after="0"/>
+              <w:jc w:val="left"/>
+              <w:rPr>
                 <w:i/>
               </w:rPr>
             </w:pPr>
@@ -420,18 +416,17 @@
         </w:tc>
         <w:tc>
           <w:tcPr>
-            <w:tcW w:w="6089" w:type="dxa"/>
-            <w:tcBorders/>
-          </w:tcPr>
-          <w:p>
-            <w:pPr>
-              <w:pStyle w:val="Normal"/>
-              <w:widowControl/>
-              <w:suppressAutoHyphens w:val="true"/>
-              <w:spacing w:lineRule="auto" w:line="240" w:before="0" w:after="0"/>
-              <w:jc w:val="left"/>
-              <w:rPr>
-                <w:i/>
+            <w:tcW w:w="6090" w:type="dxa"/>
+            <w:tcBorders/>
+          </w:tcPr>
+          <w:p>
+            <w:pPr>
+              <w:pStyle w:val="Normal"/>
+              <w:widowControl/>
+              <w:suppressAutoHyphens w:val="true"/>
+              <w:spacing w:lineRule="auto" w:line="240" w:before="0" w:after="0"/>
+              <w:jc w:val="left"/>
+              <w:rPr>
                 <w:i/>
               </w:rPr>
             </w:pPr>
@@ -494,18 +489,17 @@
         </w:tc>
         <w:tc>
           <w:tcPr>
-            <w:tcW w:w="6089" w:type="dxa"/>
-            <w:tcBorders/>
-          </w:tcPr>
-          <w:p>
-            <w:pPr>
-              <w:pStyle w:val="Normal"/>
-              <w:widowControl/>
-              <w:suppressAutoHyphens w:val="true"/>
-              <w:spacing w:lineRule="auto" w:line="240" w:before="0" w:after="0"/>
-              <w:jc w:val="left"/>
-              <w:rPr>
-                <w:i/>
+            <w:tcW w:w="6090" w:type="dxa"/>
+            <w:tcBorders/>
+          </w:tcPr>
+          <w:p>
+            <w:pPr>
+              <w:pStyle w:val="Normal"/>
+              <w:widowControl/>
+              <w:suppressAutoHyphens w:val="true"/>
+              <w:spacing w:lineRule="auto" w:line="240" w:before="0" w:after="0"/>
+              <w:jc w:val="left"/>
+              <w:rPr>
                 <w:i/>
               </w:rPr>
             </w:pPr>
@@ -568,18 +562,17 @@
         </w:tc>
         <w:tc>
           <w:tcPr>
-            <w:tcW w:w="6089" w:type="dxa"/>
-            <w:tcBorders/>
-          </w:tcPr>
-          <w:p>
-            <w:pPr>
-              <w:pStyle w:val="Normal"/>
-              <w:widowControl/>
-              <w:suppressAutoHyphens w:val="true"/>
-              <w:spacing w:lineRule="auto" w:line="240" w:before="0" w:after="0"/>
-              <w:jc w:val="left"/>
-              <w:rPr>
-                <w:i/>
+            <w:tcW w:w="6090" w:type="dxa"/>
+            <w:tcBorders/>
+          </w:tcPr>
+          <w:p>
+            <w:pPr>
+              <w:pStyle w:val="Normal"/>
+              <w:widowControl/>
+              <w:suppressAutoHyphens w:val="true"/>
+              <w:spacing w:lineRule="auto" w:line="240" w:before="0" w:after="0"/>
+              <w:jc w:val="left"/>
+              <w:rPr>
                 <w:i/>
               </w:rPr>
             </w:pPr>
@@ -631,18 +624,17 @@
         </w:tc>
         <w:tc>
           <w:tcPr>
-            <w:tcW w:w="6089" w:type="dxa"/>
-            <w:tcBorders/>
-          </w:tcPr>
-          <w:p>
-            <w:pPr>
-              <w:pStyle w:val="Normal"/>
-              <w:widowControl/>
-              <w:suppressAutoHyphens w:val="true"/>
-              <w:spacing w:lineRule="auto" w:line="240" w:before="0" w:after="0"/>
-              <w:jc w:val="left"/>
-              <w:rPr>
-                <w:i/>
+            <w:tcW w:w="6090" w:type="dxa"/>
+            <w:tcBorders/>
+          </w:tcPr>
+          <w:p>
+            <w:pPr>
+              <w:pStyle w:val="Normal"/>
+              <w:widowControl/>
+              <w:suppressAutoHyphens w:val="true"/>
+              <w:spacing w:lineRule="auto" w:line="240" w:before="0" w:after="0"/>
+              <w:jc w:val="left"/>
+              <w:rPr>
                 <w:i/>
               </w:rPr>
             </w:pPr>
@@ -671,7 +663,6 @@
               <w:jc w:val="left"/>
               <w:rPr>
                 <w:i/>
-                <w:i/>
               </w:rPr>
             </w:pPr>
             <w:r>
@@ -695,7 +686,6 @@
               <w:jc w:val="left"/>
               <w:rPr>
                 <w:i/>
-                <w:i/>
               </w:rPr>
             </w:pPr>
             <w:r>
@@ -719,7 +709,6 @@
               <w:jc w:val="left"/>
               <w:rPr>
                 <w:i/>
-                <w:i/>
               </w:rPr>
             </w:pPr>
             <w:r>
@@ -743,7 +732,6 @@
               <w:jc w:val="left"/>
               <w:rPr>
                 <w:i/>
-                <w:i/>
               </w:rPr>
             </w:pPr>
             <w:r>
@@ -767,24 +755,22 @@
               <w:jc w:val="left"/>
               <w:rPr>
                 <w:i/>
-                <w:i/>
-              </w:rPr>
-            </w:pPr>
-            <w:r>
-              <w:rPr>
-                <w:i/>
-              </w:rPr>
-            </w:r>
-          </w:p>
-          <w:p>
-            <w:pPr>
-              <w:pStyle w:val="Normal"/>
-              <w:widowControl/>
-              <w:suppressAutoHyphens w:val="true"/>
-              <w:spacing w:lineRule="auto" w:line="240" w:before="0" w:after="0"/>
-              <w:jc w:val="left"/>
-              <w:rPr>
-                <w:i/>
+              </w:rPr>
+            </w:pPr>
+            <w:r>
+              <w:rPr>
+                <w:i/>
+              </w:rPr>
+            </w:r>
+          </w:p>
+          <w:p>
+            <w:pPr>
+              <w:pStyle w:val="Normal"/>
+              <w:widowControl/>
+              <w:suppressAutoHyphens w:val="true"/>
+              <w:spacing w:lineRule="auto" w:line="240" w:before="0" w:after="0"/>
+              <w:jc w:val="left"/>
+              <w:rPr>
                 <w:i/>
               </w:rPr>
             </w:pPr>
@@ -835,11 +821,11 @@
           <w:bottom w:w="0" w:type="dxa"/>
           <w:right w:w="108" w:type="dxa"/>
         </w:tblCellMar>
-        <w:tblLook w:firstRow="1" w:noVBand="1" w:lastRow="0" w:firstColumn="1" w:lastColumn="0" w:noHBand="0" w:val="04a0"/>
+        <w:tblLook w:val="04a0" w:firstRow="1" w:noVBand="1" w:lastRow="0" w:firstColumn="1" w:lastColumn="0" w:noHBand="0"/>
       </w:tblPr>
       <w:tblGrid>
         <w:gridCol w:w="2965"/>
-        <w:gridCol w:w="6096"/>
+        <w:gridCol w:w="6097"/>
       </w:tblGrid>
       <w:tr>
         <w:trPr/>
@@ -875,18 +861,17 @@
         </w:tc>
         <w:tc>
           <w:tcPr>
-            <w:tcW w:w="6096" w:type="dxa"/>
-            <w:tcBorders/>
-          </w:tcPr>
-          <w:p>
-            <w:pPr>
-              <w:pStyle w:val="Normal"/>
-              <w:widowControl/>
-              <w:suppressAutoHyphens w:val="true"/>
-              <w:spacing w:lineRule="auto" w:line="240" w:before="0" w:after="0"/>
-              <w:jc w:val="left"/>
-              <w:rPr>
-                <w:i/>
+            <w:tcW w:w="6097" w:type="dxa"/>
+            <w:tcBorders/>
+          </w:tcPr>
+          <w:p>
+            <w:pPr>
+              <w:pStyle w:val="Normal"/>
+              <w:widowControl/>
+              <w:suppressAutoHyphens w:val="true"/>
+              <w:spacing w:lineRule="auto" w:line="240" w:before="0" w:after="0"/>
+              <w:jc w:val="left"/>
+              <w:rPr>
                 <w:i/>
               </w:rPr>
             </w:pPr>
@@ -964,53 +949,30 @@
         </w:tc>
         <w:tc>
           <w:tcPr>
-            <w:tcW w:w="6096" w:type="dxa"/>
-            <w:tcBorders/>
-          </w:tcPr>
-          <w:p>
-            <w:pPr>
-              <w:pStyle w:val="Normal"/>
-              <w:widowControl/>
-              <w:suppressAutoHyphens w:val="true"/>
-              <w:spacing w:lineRule="auto" w:line="240" w:before="0" w:after="0"/>
-              <w:jc w:val="left"/>
-              <w:rPr>
-                <w:i/>
-                <w:i/>
-              </w:rPr>
-            </w:pPr>
-            <w:r>
-              <w:rPr>
-                <w:rFonts w:eastAsia="Calibri" w:cs=""/>
-                <w:i/>
-                <w:kern w:val="0"/>
-                <w:sz w:val="22"/>
-                <w:szCs w:val="22"/>
-                <w:lang w:val="pl-PL" w:eastAsia="en-US" w:bidi="ar-SA"/>
-              </w:rPr>
-              <w:t xml:space="preserve">GanttProject, IntelliJ IDEA, Visual Studio Code, Docker, XAMPP, EasyEDA, Student Docs LaTeX Template System, Android Studio, Arduino IDE, GitHub, </w:t>
-            </w:r>
-            <w:r>
-              <w:rPr>
-                <w:rFonts w:eastAsia="Calibri" w:cs=""/>
-                <w:i/>
-                <w:kern w:val="0"/>
-                <w:sz w:val="22"/>
-                <w:szCs w:val="22"/>
-                <w:lang w:val="pl-PL" w:eastAsia="en-US" w:bidi="ar-SA"/>
-              </w:rPr>
-              <w:t xml:space="preserve">PlantUML, </w:t>
-            </w:r>
-            <w:r>
-              <w:rPr>
-                <w:rFonts w:eastAsia="Calibri" w:cs=""/>
-                <w:i/>
-                <w:kern w:val="0"/>
-                <w:sz w:val="22"/>
-                <w:szCs w:val="22"/>
-                <w:lang w:val="pl-PL" w:eastAsia="en-US" w:bidi="ar-SA"/>
-              </w:rPr>
-              <w:t>ESP32, DHT11, Komputer PC, Laptop, Smartfon</w:t>
+            <w:tcW w:w="6097" w:type="dxa"/>
+            <w:tcBorders/>
+          </w:tcPr>
+          <w:p>
+            <w:pPr>
+              <w:pStyle w:val="Normal"/>
+              <w:widowControl/>
+              <w:suppressAutoHyphens w:val="true"/>
+              <w:spacing w:lineRule="auto" w:line="240" w:before="0" w:after="0"/>
+              <w:jc w:val="left"/>
+              <w:rPr>
+                <w:i/>
+              </w:rPr>
+            </w:pPr>
+            <w:r>
+              <w:rPr>
+                <w:rFonts w:eastAsia="Calibri" w:cs=""/>
+                <w:i/>
+                <w:kern w:val="0"/>
+                <w:sz w:val="22"/>
+                <w:szCs w:val="22"/>
+                <w:lang w:val="pl-PL" w:eastAsia="en-US" w:bidi="ar-SA"/>
+              </w:rPr>
+              <w:t>GanttProject, IntelliJ IDEA, Visual Studio Code, Docker, XAMPP, EasyEDA, Student Docs LaTeX Template System, Android Studio, Arduino IDE, GitHub, PlantUML, ESP32, DHT11, Komputer PC, Laptop, Smartfon</w:t>
             </w:r>
           </w:p>
         </w:tc>
@@ -1049,18 +1011,17 @@
         </w:tc>
         <w:tc>
           <w:tcPr>
-            <w:tcW w:w="6096" w:type="dxa"/>
-            <w:tcBorders/>
-          </w:tcPr>
-          <w:p>
-            <w:pPr>
-              <w:pStyle w:val="Normal"/>
-              <w:widowControl/>
-              <w:suppressAutoHyphens w:val="true"/>
-              <w:spacing w:lineRule="auto" w:line="240" w:before="0" w:after="0"/>
-              <w:jc w:val="left"/>
-              <w:rPr>
-                <w:i/>
+            <w:tcW w:w="6097" w:type="dxa"/>
+            <w:tcBorders/>
+          </w:tcPr>
+          <w:p>
+            <w:pPr>
+              <w:pStyle w:val="Normal"/>
+              <w:widowControl/>
+              <w:suppressAutoHyphens w:val="true"/>
+              <w:spacing w:lineRule="auto" w:line="240" w:before="0" w:after="0"/>
+              <w:jc w:val="left"/>
+              <w:rPr>
                 <w:i/>
               </w:rPr>
             </w:pPr>
@@ -1114,18 +1075,17 @@
         </w:tc>
         <w:tc>
           <w:tcPr>
-            <w:tcW w:w="6096" w:type="dxa"/>
-            <w:tcBorders/>
-          </w:tcPr>
-          <w:p>
-            <w:pPr>
-              <w:pStyle w:val="Normal"/>
-              <w:widowControl/>
-              <w:suppressAutoHyphens w:val="true"/>
-              <w:spacing w:lineRule="auto" w:line="240" w:before="0" w:after="0"/>
-              <w:jc w:val="left"/>
-              <w:rPr>
-                <w:i/>
+            <w:tcW w:w="6097" w:type="dxa"/>
+            <w:tcBorders/>
+          </w:tcPr>
+          <w:p>
+            <w:pPr>
+              <w:pStyle w:val="Normal"/>
+              <w:widowControl/>
+              <w:suppressAutoHyphens w:val="true"/>
+              <w:spacing w:lineRule="auto" w:line="240" w:before="0" w:after="0"/>
+              <w:jc w:val="left"/>
+              <w:rPr>
                 <w:i/>
               </w:rPr>
             </w:pPr>
@@ -1177,18 +1137,17 @@
         </w:tc>
         <w:tc>
           <w:tcPr>
-            <w:tcW w:w="6096" w:type="dxa"/>
-            <w:tcBorders/>
-          </w:tcPr>
-          <w:p>
-            <w:pPr>
-              <w:pStyle w:val="Normal"/>
-              <w:widowControl/>
-              <w:suppressAutoHyphens w:val="true"/>
-              <w:spacing w:lineRule="auto" w:line="240" w:before="0" w:after="0"/>
-              <w:jc w:val="left"/>
-              <w:rPr>
-                <w:i/>
+            <w:tcW w:w="6097" w:type="dxa"/>
+            <w:tcBorders/>
+          </w:tcPr>
+          <w:p>
+            <w:pPr>
+              <w:pStyle w:val="Normal"/>
+              <w:widowControl/>
+              <w:suppressAutoHyphens w:val="true"/>
+              <w:spacing w:lineRule="auto" w:line="240" w:before="0" w:after="0"/>
+              <w:jc w:val="left"/>
+              <w:rPr>
                 <w:i/>
               </w:rPr>
             </w:pPr>
@@ -1240,18 +1199,17 @@
         </w:tc>
         <w:tc>
           <w:tcPr>
-            <w:tcW w:w="6096" w:type="dxa"/>
-            <w:tcBorders/>
-          </w:tcPr>
-          <w:p>
-            <w:pPr>
-              <w:pStyle w:val="Normal"/>
-              <w:widowControl/>
-              <w:suppressAutoHyphens w:val="true"/>
-              <w:spacing w:lineRule="auto" w:line="240" w:before="0" w:after="0"/>
-              <w:jc w:val="left"/>
-              <w:rPr>
-                <w:i/>
+            <w:tcW w:w="6097" w:type="dxa"/>
+            <w:tcBorders/>
+          </w:tcPr>
+          <w:p>
+            <w:pPr>
+              <w:pStyle w:val="Normal"/>
+              <w:widowControl/>
+              <w:suppressAutoHyphens w:val="true"/>
+              <w:spacing w:lineRule="auto" w:line="240" w:before="0" w:after="0"/>
+              <w:jc w:val="left"/>
+              <w:rPr>
                 <w:i/>
               </w:rPr>
             </w:pPr>
@@ -1303,18 +1261,17 @@
         </w:tc>
         <w:tc>
           <w:tcPr>
-            <w:tcW w:w="6096" w:type="dxa"/>
-            <w:tcBorders/>
-          </w:tcPr>
-          <w:p>
-            <w:pPr>
-              <w:pStyle w:val="Normal"/>
-              <w:widowControl/>
-              <w:suppressAutoHyphens w:val="true"/>
-              <w:spacing w:lineRule="auto" w:line="240" w:before="0" w:after="0"/>
-              <w:jc w:val="left"/>
-              <w:rPr>
-                <w:i/>
+            <w:tcW w:w="6097" w:type="dxa"/>
+            <w:tcBorders/>
+          </w:tcPr>
+          <w:p>
+            <w:pPr>
+              <w:pStyle w:val="Normal"/>
+              <w:widowControl/>
+              <w:suppressAutoHyphens w:val="true"/>
+              <w:spacing w:lineRule="auto" w:line="240" w:before="0" w:after="0"/>
+              <w:jc w:val="left"/>
+              <w:rPr>
                 <w:i/>
               </w:rPr>
             </w:pPr>
@@ -1366,18 +1323,17 @@
         </w:tc>
         <w:tc>
           <w:tcPr>
-            <w:tcW w:w="6096" w:type="dxa"/>
-            <w:tcBorders/>
-          </w:tcPr>
-          <w:p>
-            <w:pPr>
-              <w:pStyle w:val="Normal"/>
-              <w:widowControl/>
-              <w:suppressAutoHyphens w:val="true"/>
-              <w:spacing w:lineRule="auto" w:line="240" w:before="0" w:after="0"/>
-              <w:jc w:val="left"/>
-              <w:rPr>
-                <w:i/>
+            <w:tcW w:w="6097" w:type="dxa"/>
+            <w:tcBorders/>
+          </w:tcPr>
+          <w:p>
+            <w:pPr>
+              <w:pStyle w:val="Normal"/>
+              <w:widowControl/>
+              <w:suppressAutoHyphens w:val="true"/>
+              <w:spacing w:lineRule="auto" w:line="240" w:before="0" w:after="0"/>
+              <w:jc w:val="left"/>
+              <w:rPr>
                 <w:i/>
               </w:rPr>
             </w:pPr>
@@ -1399,7 +1355,7 @@
         <w:trPr/>
         <w:tc>
           <w:tcPr>
-            <w:tcW w:w="9061" w:type="dxa"/>
+            <w:tcW w:w="9062" w:type="dxa"/>
             <w:gridSpan w:val="2"/>
             <w:tcBorders/>
             <w:shd w:color="auto" w:fill="C5E0B3" w:themeFill="accent6" w:themeFillTint="66" w:val="clear"/>
@@ -1413,7 +1369,6 @@
               <w:jc w:val="center"/>
               <w:rPr>
                 <w:b/>
-                <w:i/>
                 <w:i/>
               </w:rPr>
             </w:pPr>
@@ -1466,18 +1421,17 @@
         </w:tc>
         <w:tc>
           <w:tcPr>
-            <w:tcW w:w="6096" w:type="dxa"/>
-            <w:tcBorders/>
-          </w:tcPr>
-          <w:p>
-            <w:pPr>
-              <w:pStyle w:val="Normal"/>
-              <w:widowControl/>
-              <w:suppressAutoHyphens w:val="true"/>
-              <w:spacing w:lineRule="auto" w:line="240" w:before="0" w:after="0"/>
-              <w:jc w:val="left"/>
-              <w:rPr>
-                <w:i/>
+            <w:tcW w:w="6097" w:type="dxa"/>
+            <w:tcBorders/>
+          </w:tcPr>
+          <w:p>
+            <w:pPr>
+              <w:pStyle w:val="Normal"/>
+              <w:widowControl/>
+              <w:suppressAutoHyphens w:val="true"/>
+              <w:spacing w:lineRule="auto" w:line="240" w:before="0" w:after="0"/>
+              <w:jc w:val="left"/>
+              <w:rPr>
                 <w:i/>
               </w:rPr>
             </w:pPr>
@@ -1552,18 +1506,17 @@
         </w:tc>
         <w:tc>
           <w:tcPr>
-            <w:tcW w:w="6096" w:type="dxa"/>
-            <w:tcBorders/>
-          </w:tcPr>
-          <w:p>
-            <w:pPr>
-              <w:pStyle w:val="Normal"/>
-              <w:widowControl/>
-              <w:suppressAutoHyphens w:val="true"/>
-              <w:spacing w:lineRule="auto" w:line="240" w:before="0" w:after="0"/>
-              <w:jc w:val="left"/>
-              <w:rPr>
-                <w:i/>
+            <w:tcW w:w="6097" w:type="dxa"/>
+            <w:tcBorders/>
+          </w:tcPr>
+          <w:p>
+            <w:pPr>
+              <w:pStyle w:val="Normal"/>
+              <w:widowControl/>
+              <w:suppressAutoHyphens w:val="true"/>
+              <w:spacing w:lineRule="auto" w:line="240" w:before="0" w:after="0"/>
+              <w:jc w:val="left"/>
+              <w:rPr>
                 <w:i/>
               </w:rPr>
             </w:pPr>
@@ -1615,18 +1568,17 @@
         </w:tc>
         <w:tc>
           <w:tcPr>
-            <w:tcW w:w="6096" w:type="dxa"/>
-            <w:tcBorders/>
-          </w:tcPr>
-          <w:p>
-            <w:pPr>
-              <w:pStyle w:val="Normal"/>
-              <w:widowControl/>
-              <w:suppressAutoHyphens w:val="true"/>
-              <w:spacing w:lineRule="auto" w:line="240" w:before="0" w:after="0"/>
-              <w:jc w:val="left"/>
-              <w:rPr>
-                <w:i/>
+            <w:tcW w:w="6097" w:type="dxa"/>
+            <w:tcBorders/>
+          </w:tcPr>
+          <w:p>
+            <w:pPr>
+              <w:pStyle w:val="Normal"/>
+              <w:widowControl/>
+              <w:suppressAutoHyphens w:val="true"/>
+              <w:spacing w:lineRule="auto" w:line="240" w:before="0" w:after="0"/>
+              <w:jc w:val="left"/>
+              <w:rPr>
                 <w:i/>
               </w:rPr>
             </w:pPr>
@@ -1700,31 +1652,52 @@
         </w:tc>
         <w:tc>
           <w:tcPr>
-            <w:tcW w:w="6096" w:type="dxa"/>
-            <w:tcBorders/>
-          </w:tcPr>
-          <w:p>
-            <w:pPr>
-              <w:pStyle w:val="Normal"/>
-              <w:widowControl/>
-              <w:suppressAutoHyphens w:val="true"/>
-              <w:spacing w:lineRule="auto" w:line="240" w:before="0" w:after="0"/>
-              <w:jc w:val="left"/>
-              <w:rPr>
-                <w:i/>
-                <w:i/>
-              </w:rPr>
-            </w:pPr>
-            <w:r>
-              <w:rPr>
-                <w:rFonts w:eastAsia="Calibri" w:cs=""/>
-                <w:i/>
-                <w:kern w:val="0"/>
-                <w:sz w:val="22"/>
-                <w:szCs w:val="22"/>
-                <w:lang w:val="pl-PL" w:eastAsia="en-US" w:bidi="ar-SA"/>
-              </w:rPr>
-              <w:t>Dbałość o dobry odczyt danych i komunikację systemu ESP + DHT11 z serwerem</w:t>
+            <w:tcW w:w="6097" w:type="dxa"/>
+            <w:tcBorders/>
+          </w:tcPr>
+          <w:p>
+            <w:pPr>
+              <w:pStyle w:val="Normal"/>
+              <w:widowControl/>
+              <w:suppressAutoHyphens w:val="true"/>
+              <w:spacing w:lineRule="auto" w:line="240" w:before="0" w:after="0"/>
+              <w:jc w:val="left"/>
+              <w:rPr>
+                <w:i/>
+              </w:rPr>
+            </w:pPr>
+            <w:r>
+              <w:rPr>
+                <w:rFonts w:eastAsia="Calibri" w:cs=""/>
+                <w:i/>
+                <w:kern w:val="0"/>
+                <w:sz w:val="22"/>
+                <w:szCs w:val="22"/>
+                <w:lang w:val="pl-PL" w:eastAsia="en-US" w:bidi="ar-SA"/>
+              </w:rPr>
+              <w:t>Dbałość o dobry odczyt danych i komunikację systemu ESP</w:t>
+            </w:r>
+            <w:r>
+              <w:rPr>
+                <w:rFonts w:eastAsia="Calibri" w:cs=""/>
+                <w:i/>
+                <w:kern w:val="0"/>
+                <w:sz w:val="22"/>
+                <w:szCs w:val="22"/>
+                <w:lang w:val="pl-PL" w:eastAsia="en-US" w:bidi="ar-SA"/>
+              </w:rPr>
+              <w:t>32</w:t>
+            </w:r>
+            <w:r>
+              <w:rPr>
+                <w:rFonts w:eastAsia="Calibri" w:cs=""/>
+                <w:i/>
+                <w:kern w:val="0"/>
+                <w:sz w:val="22"/>
+                <w:szCs w:val="22"/>
+                <w:lang w:val="pl-PL" w:eastAsia="en-US" w:bidi="ar-SA"/>
+              </w:rPr>
+              <w:t xml:space="preserve"> + DHT11 z serwerem</w:t>
             </w:r>
           </w:p>
         </w:tc>
@@ -1785,18 +1758,17 @@
         </w:tc>
         <w:tc>
           <w:tcPr>
-            <w:tcW w:w="6096" w:type="dxa"/>
-            <w:tcBorders/>
-          </w:tcPr>
-          <w:p>
-            <w:pPr>
-              <w:pStyle w:val="Normal"/>
-              <w:widowControl/>
-              <w:suppressAutoHyphens w:val="true"/>
-              <w:spacing w:lineRule="auto" w:line="240" w:before="0" w:after="0"/>
-              <w:jc w:val="left"/>
-              <w:rPr>
-                <w:i/>
+            <w:tcW w:w="6097" w:type="dxa"/>
+            <w:tcBorders/>
+          </w:tcPr>
+          <w:p>
+            <w:pPr>
+              <w:pStyle w:val="Normal"/>
+              <w:widowControl/>
+              <w:suppressAutoHyphens w:val="true"/>
+              <w:spacing w:lineRule="auto" w:line="240" w:before="0" w:after="0"/>
+              <w:jc w:val="left"/>
+              <w:rPr>
                 <w:i/>
               </w:rPr>
             </w:pPr>
@@ -1818,7 +1790,7 @@
         <w:trPr/>
         <w:tc>
           <w:tcPr>
-            <w:tcW w:w="9061" w:type="dxa"/>
+            <w:tcW w:w="9062" w:type="dxa"/>
             <w:gridSpan w:val="2"/>
             <w:tcBorders/>
             <w:shd w:color="auto" w:fill="C5E0B3" w:themeFill="accent6" w:themeFillTint="66" w:val="clear"/>
@@ -1832,7 +1804,6 @@
               <w:jc w:val="center"/>
               <w:rPr>
                 <w:b/>
-                <w:i/>
                 <w:i/>
               </w:rPr>
             </w:pPr>
@@ -1885,18 +1856,17 @@
         </w:tc>
         <w:tc>
           <w:tcPr>
-            <w:tcW w:w="6096" w:type="dxa"/>
-            <w:tcBorders/>
-          </w:tcPr>
-          <w:p>
-            <w:pPr>
-              <w:pStyle w:val="Normal"/>
-              <w:widowControl/>
-              <w:suppressAutoHyphens w:val="true"/>
-              <w:spacing w:lineRule="auto" w:line="240" w:before="0" w:after="0"/>
-              <w:jc w:val="left"/>
-              <w:rPr>
-                <w:i/>
+            <w:tcW w:w="6097" w:type="dxa"/>
+            <w:tcBorders/>
+          </w:tcPr>
+          <w:p>
+            <w:pPr>
+              <w:pStyle w:val="Normal"/>
+              <w:widowControl/>
+              <w:suppressAutoHyphens w:val="true"/>
+              <w:spacing w:lineRule="auto" w:line="240" w:before="0" w:after="0"/>
+              <w:jc w:val="left"/>
+              <w:rPr>
                 <w:i/>
               </w:rPr>
             </w:pPr>
@@ -1973,18 +1943,17 @@
         </w:tc>
         <w:tc>
           <w:tcPr>
-            <w:tcW w:w="6096" w:type="dxa"/>
-            <w:tcBorders/>
-          </w:tcPr>
-          <w:p>
-            <w:pPr>
-              <w:pStyle w:val="Normal"/>
-              <w:widowControl/>
-              <w:suppressAutoHyphens w:val="true"/>
-              <w:spacing w:lineRule="auto" w:line="240" w:before="0" w:after="0"/>
-              <w:jc w:val="left"/>
-              <w:rPr>
-                <w:i/>
+            <w:tcW w:w="6097" w:type="dxa"/>
+            <w:tcBorders/>
+          </w:tcPr>
+          <w:p>
+            <w:pPr>
+              <w:pStyle w:val="Normal"/>
+              <w:widowControl/>
+              <w:suppressAutoHyphens w:val="true"/>
+              <w:spacing w:lineRule="auto" w:line="240" w:before="0" w:after="0"/>
+              <w:jc w:val="left"/>
+              <w:rPr>
                 <w:i/>
               </w:rPr>
             </w:pPr>
@@ -2036,18 +2005,17 @@
         </w:tc>
         <w:tc>
           <w:tcPr>
-            <w:tcW w:w="6096" w:type="dxa"/>
-            <w:tcBorders/>
-          </w:tcPr>
-          <w:p>
-            <w:pPr>
-              <w:pStyle w:val="Normal"/>
-              <w:widowControl/>
-              <w:suppressAutoHyphens w:val="true"/>
-              <w:spacing w:lineRule="auto" w:line="240" w:before="0" w:after="0"/>
-              <w:jc w:val="left"/>
-              <w:rPr>
-                <w:i/>
+            <w:tcW w:w="6097" w:type="dxa"/>
+            <w:tcBorders/>
+          </w:tcPr>
+          <w:p>
+            <w:pPr>
+              <w:pStyle w:val="Normal"/>
+              <w:widowControl/>
+              <w:suppressAutoHyphens w:val="true"/>
+              <w:spacing w:lineRule="auto" w:line="240" w:before="0" w:after="0"/>
+              <w:jc w:val="left"/>
+              <w:rPr>
                 <w:i/>
               </w:rPr>
             </w:pPr>
@@ -2121,18 +2089,17 @@
         </w:tc>
         <w:tc>
           <w:tcPr>
-            <w:tcW w:w="6096" w:type="dxa"/>
-            <w:tcBorders/>
-          </w:tcPr>
-          <w:p>
-            <w:pPr>
-              <w:pStyle w:val="Normal"/>
-              <w:widowControl/>
-              <w:suppressAutoHyphens w:val="true"/>
-              <w:spacing w:lineRule="auto" w:line="240" w:before="0" w:after="0"/>
-              <w:jc w:val="left"/>
-              <w:rPr>
-                <w:i/>
+            <w:tcW w:w="6097" w:type="dxa"/>
+            <w:tcBorders/>
+          </w:tcPr>
+          <w:p>
+            <w:pPr>
+              <w:pStyle w:val="Normal"/>
+              <w:widowControl/>
+              <w:suppressAutoHyphens w:val="true"/>
+              <w:spacing w:lineRule="auto" w:line="240" w:before="0" w:after="0"/>
+              <w:jc w:val="left"/>
+              <w:rPr>
                 <w:i/>
               </w:rPr>
             </w:pPr>
@@ -2210,7 +2177,7 @@
         </w:tc>
         <w:tc>
           <w:tcPr>
-            <w:tcW w:w="6096" w:type="dxa"/>
+            <w:tcW w:w="6097" w:type="dxa"/>
             <w:tcBorders/>
           </w:tcPr>
           <w:p>
@@ -2245,7 +2212,7 @@
         <w:trPr/>
         <w:tc>
           <w:tcPr>
-            <w:tcW w:w="9061" w:type="dxa"/>
+            <w:tcW w:w="9062" w:type="dxa"/>
             <w:gridSpan w:val="2"/>
             <w:tcBorders/>
             <w:shd w:color="auto" w:fill="C5E0B3" w:themeFill="accent6" w:themeFillTint="66" w:val="clear"/>
@@ -2259,7 +2226,6 @@
               <w:jc w:val="center"/>
               <w:rPr>
                 <w:b/>
-                <w:i/>
                 <w:i/>
               </w:rPr>
             </w:pPr>
@@ -2312,18 +2278,17 @@
         </w:tc>
         <w:tc>
           <w:tcPr>
-            <w:tcW w:w="6096" w:type="dxa"/>
-            <w:tcBorders/>
-          </w:tcPr>
-          <w:p>
-            <w:pPr>
-              <w:pStyle w:val="Normal"/>
-              <w:widowControl/>
-              <w:suppressAutoHyphens w:val="true"/>
-              <w:spacing w:lineRule="auto" w:line="240" w:before="0" w:after="0"/>
-              <w:jc w:val="left"/>
-              <w:rPr>
-                <w:i/>
+            <w:tcW w:w="6097" w:type="dxa"/>
+            <w:tcBorders/>
+          </w:tcPr>
+          <w:p>
+            <w:pPr>
+              <w:pStyle w:val="Normal"/>
+              <w:widowControl/>
+              <w:suppressAutoHyphens w:val="true"/>
+              <w:spacing w:lineRule="auto" w:line="240" w:before="0" w:after="0"/>
+              <w:jc w:val="left"/>
+              <w:rPr>
                 <w:i/>
               </w:rPr>
             </w:pPr>
@@ -2398,18 +2363,17 @@
         </w:tc>
         <w:tc>
           <w:tcPr>
-            <w:tcW w:w="6096" w:type="dxa"/>
-            <w:tcBorders/>
-          </w:tcPr>
-          <w:p>
-            <w:pPr>
-              <w:pStyle w:val="Normal"/>
-              <w:widowControl/>
-              <w:suppressAutoHyphens w:val="true"/>
-              <w:spacing w:lineRule="auto" w:line="240" w:before="0" w:after="0"/>
-              <w:jc w:val="left"/>
-              <w:rPr>
-                <w:i/>
+            <w:tcW w:w="6097" w:type="dxa"/>
+            <w:tcBorders/>
+          </w:tcPr>
+          <w:p>
+            <w:pPr>
+              <w:pStyle w:val="Normal"/>
+              <w:widowControl/>
+              <w:suppressAutoHyphens w:val="true"/>
+              <w:spacing w:lineRule="auto" w:line="240" w:before="0" w:after="0"/>
+              <w:jc w:val="left"/>
+              <w:rPr>
                 <w:i/>
               </w:rPr>
             </w:pPr>
@@ -2461,18 +2425,17 @@
         </w:tc>
         <w:tc>
           <w:tcPr>
-            <w:tcW w:w="6096" w:type="dxa"/>
-            <w:tcBorders/>
-          </w:tcPr>
-          <w:p>
-            <w:pPr>
-              <w:pStyle w:val="Normal"/>
-              <w:widowControl/>
-              <w:suppressAutoHyphens w:val="true"/>
-              <w:spacing w:lineRule="auto" w:line="240" w:before="0" w:after="0"/>
-              <w:jc w:val="left"/>
-              <w:rPr>
-                <w:i/>
+            <w:tcW w:w="6097" w:type="dxa"/>
+            <w:tcBorders/>
+          </w:tcPr>
+          <w:p>
+            <w:pPr>
+              <w:pStyle w:val="Normal"/>
+              <w:widowControl/>
+              <w:suppressAutoHyphens w:val="true"/>
+              <w:spacing w:lineRule="auto" w:line="240" w:before="0" w:after="0"/>
+              <w:jc w:val="left"/>
+              <w:rPr>
                 <w:i/>
               </w:rPr>
             </w:pPr>
@@ -2547,18 +2510,17 @@
         </w:tc>
         <w:tc>
           <w:tcPr>
-            <w:tcW w:w="6096" w:type="dxa"/>
-            <w:tcBorders/>
-          </w:tcPr>
-          <w:p>
-            <w:pPr>
-              <w:pStyle w:val="Normal"/>
-              <w:widowControl/>
-              <w:suppressAutoHyphens w:val="true"/>
-              <w:spacing w:lineRule="auto" w:line="240" w:before="0" w:after="0"/>
-              <w:jc w:val="left"/>
-              <w:rPr>
-                <w:i/>
+            <w:tcW w:w="6097" w:type="dxa"/>
+            <w:tcBorders/>
+          </w:tcPr>
+          <w:p>
+            <w:pPr>
+              <w:pStyle w:val="Normal"/>
+              <w:widowControl/>
+              <w:suppressAutoHyphens w:val="true"/>
+              <w:spacing w:lineRule="auto" w:line="240" w:before="0" w:after="0"/>
+              <w:jc w:val="left"/>
+              <w:rPr>
                 <w:i/>
               </w:rPr>
             </w:pPr>
@@ -2636,31 +2598,41 @@
         </w:tc>
         <w:tc>
           <w:tcPr>
-            <w:tcW w:w="6096" w:type="dxa"/>
-            <w:tcBorders/>
-          </w:tcPr>
-          <w:p>
-            <w:pPr>
-              <w:pStyle w:val="Normal"/>
-              <w:widowControl/>
-              <w:suppressAutoHyphens w:val="true"/>
-              <w:spacing w:lineRule="auto" w:line="240" w:before="0" w:after="0"/>
-              <w:jc w:val="left"/>
-              <w:rPr>
-                <w:i/>
-                <w:i/>
-              </w:rPr>
-            </w:pPr>
-            <w:r>
-              <w:rPr>
-                <w:rFonts w:eastAsia="Calibri" w:cs=""/>
-                <w:i/>
-                <w:kern w:val="0"/>
-                <w:sz w:val="22"/>
-                <w:szCs w:val="22"/>
-                <w:lang w:val="pl-PL" w:eastAsia="en-US" w:bidi="ar-SA"/>
-              </w:rPr>
-              <w:t>Redakcja pliku README.md na platformę GitHub, przygotowanie końcowej prezentacji</w:t>
+            <w:tcW w:w="6097" w:type="dxa"/>
+            <w:tcBorders/>
+          </w:tcPr>
+          <w:p>
+            <w:pPr>
+              <w:pStyle w:val="Normal"/>
+              <w:widowControl/>
+              <w:suppressAutoHyphens w:val="true"/>
+              <w:spacing w:lineRule="auto" w:line="240" w:before="0" w:after="0"/>
+              <w:jc w:val="left"/>
+              <w:rPr>
+                <w:i/>
+              </w:rPr>
+            </w:pPr>
+            <w:r>
+              <w:rPr>
+                <w:rFonts w:eastAsia="Calibri" w:cs=""/>
+                <w:i/>
+                <w:kern w:val="0"/>
+                <w:sz w:val="22"/>
+                <w:szCs w:val="22"/>
+                <w:lang w:val="pl-PL" w:eastAsia="en-US" w:bidi="ar-SA"/>
+              </w:rPr>
+              <w:t xml:space="preserve">Redakcja pliku README.md na platformę GitHub, przygotowanie końcowej prezentacji, </w:t>
+            </w:r>
+            <w:r>
+              <w:rPr>
+                <w:rFonts w:eastAsia="Calibri" w:cs=""/>
+                <w:i/>
+                <w:kern w:val="0"/>
+                <w:sz w:val="22"/>
+                <w:szCs w:val="22"/>
+                <w:lang w:val="pl-PL" w:eastAsia="en-US" w:bidi="ar-SA"/>
+              </w:rPr>
+              <w:t>stworzenie grafiki przedstawiającej schemat połączeń pomiędzy ESP32 a DHT11</w:t>
             </w:r>
           </w:p>
         </w:tc>
@@ -2669,7 +2641,7 @@
         <w:trPr/>
         <w:tc>
           <w:tcPr>
-            <w:tcW w:w="9061" w:type="dxa"/>
+            <w:tcW w:w="9062" w:type="dxa"/>
             <w:gridSpan w:val="2"/>
             <w:tcBorders/>
             <w:shd w:color="auto" w:fill="C5E0B3" w:themeFill="accent6" w:themeFillTint="66" w:val="clear"/>
@@ -2684,20 +2656,19 @@
               <w:rPr>
                 <w:b/>
                 <w:i/>
-                <w:i/>
-              </w:rPr>
-            </w:pPr>
-            <w:r>
-              <w:rPr>
-                <w:rFonts w:eastAsia="Calibri" w:cs=""/>
-                <w:b/>
-                <w:i/>
-                <w:kern w:val="0"/>
-                <w:sz w:val="22"/>
-                <w:szCs w:val="22"/>
-                <w:lang w:val="pl-PL" w:eastAsia="en-US" w:bidi="ar-SA"/>
-              </w:rPr>
-              <w:t>Kolega co powtarza rok?</w:t>
+              </w:rPr>
+            </w:pPr>
+            <w:r>
+              <w:rPr>
+                <w:rFonts w:eastAsia="Calibri" w:cs=""/>
+                <w:b/>
+                <w:i/>
+                <w:kern w:val="0"/>
+                <w:sz w:val="22"/>
+                <w:szCs w:val="22"/>
+                <w:lang w:val="pl-PL" w:eastAsia="en-US" w:bidi="ar-SA"/>
+              </w:rPr>
+              <w:t>Student 5</w:t>
             </w:r>
           </w:p>
         </w:tc>
@@ -2736,26 +2707,22 @@
         </w:tc>
         <w:tc>
           <w:tcPr>
-            <w:tcW w:w="6096" w:type="dxa"/>
-            <w:tcBorders/>
-          </w:tcPr>
-          <w:p>
-            <w:pPr>
-              <w:pStyle w:val="Normal"/>
-              <w:widowControl/>
-              <w:suppressAutoHyphens w:val="true"/>
-              <w:spacing w:lineRule="auto" w:line="240" w:before="0" w:after="0"/>
-              <w:jc w:val="left"/>
-              <w:rPr>
-                <w:i/>
-                <w:i/>
-              </w:rPr>
-            </w:pPr>
-            <w:r>
-              <w:rPr>
-                <w:i/>
-              </w:rPr>
-              <w:t>Powtarzanie roku</w:t>
+            <w:tcW w:w="6097" w:type="dxa"/>
+            <w:tcBorders/>
+          </w:tcPr>
+          <w:p>
+            <w:pPr>
+              <w:pStyle w:val="Normal"/>
+              <w:widowControl/>
+              <w:suppressAutoHyphens w:val="true"/>
+              <w:spacing w:lineRule="auto" w:line="240" w:before="0" w:after="0"/>
+              <w:jc w:val="left"/>
+              <w:rPr>
+                <w:i/>
+              </w:rPr>
+            </w:pPr>
+            <w:r>
+              <w:rPr/>
             </w:r>
           </w:p>
         </w:tc>
@@ -2817,18 +2784,17 @@
         </w:tc>
         <w:tc>
           <w:tcPr>
-            <w:tcW w:w="6096" w:type="dxa"/>
-            <w:tcBorders/>
-          </w:tcPr>
-          <w:p>
-            <w:pPr>
-              <w:pStyle w:val="Normal"/>
-              <w:widowControl/>
-              <w:suppressAutoHyphens w:val="true"/>
-              <w:spacing w:lineRule="auto" w:line="240" w:before="0" w:after="0"/>
-              <w:jc w:val="left"/>
-              <w:rPr>
-                <w:i/>
+            <w:tcW w:w="6097" w:type="dxa"/>
+            <w:tcBorders/>
+          </w:tcPr>
+          <w:p>
+            <w:pPr>
+              <w:pStyle w:val="Normal"/>
+              <w:widowControl/>
+              <w:suppressAutoHyphens w:val="true"/>
+              <w:spacing w:lineRule="auto" w:line="240" w:before="0" w:after="0"/>
+              <w:jc w:val="left"/>
+              <w:rPr>
                 <w:i/>
               </w:rPr>
             </w:pPr>
@@ -2874,18 +2840,97 @@
         </w:tc>
         <w:tc>
           <w:tcPr>
-            <w:tcW w:w="6096" w:type="dxa"/>
-            <w:tcBorders/>
-          </w:tcPr>
-          <w:p>
-            <w:pPr>
-              <w:pStyle w:val="Normal"/>
-              <w:widowControl/>
-              <w:suppressAutoHyphens w:val="true"/>
-              <w:spacing w:lineRule="auto" w:line="240" w:before="0" w:after="0"/>
-              <w:jc w:val="left"/>
-              <w:rPr>
-                <w:i/>
+            <w:tcW w:w="6097" w:type="dxa"/>
+            <w:tcBorders/>
+          </w:tcPr>
+          <w:p>
+            <w:pPr>
+              <w:pStyle w:val="Normal"/>
+              <w:widowControl/>
+              <w:suppressAutoHyphens w:val="true"/>
+              <w:spacing w:lineRule="auto" w:line="240" w:before="0" w:after="0"/>
+              <w:jc w:val="left"/>
+              <w:rPr>
+                <w:i/>
+              </w:rPr>
+            </w:pPr>
+            <w:r>
+              <w:rPr>
+                <w:i/>
+              </w:rPr>
+            </w:r>
+          </w:p>
+        </w:tc>
+      </w:tr>
+      <w:tr>
+        <w:trPr>
+          <w:trHeight w:val="484" w:hRule="atLeast"/>
+        </w:trPr>
+        <w:tc>
+          <w:tcPr>
+            <w:tcW w:w="2965" w:type="dxa"/>
+            <w:tcBorders/>
+            <w:shd w:color="auto" w:fill="D9D9D9" w:themeFill="background1" w:themeFillShade="d9" w:val="clear"/>
+          </w:tcPr>
+          <w:p>
+            <w:pPr>
+              <w:pStyle w:val="Normal"/>
+              <w:widowControl/>
+              <w:suppressAutoHyphens w:val="true"/>
+              <w:spacing w:lineRule="auto" w:line="240" w:before="0" w:after="0"/>
+              <w:jc w:val="left"/>
+              <w:rPr>
+                <w:b/>
+              </w:rPr>
+            </w:pPr>
+            <w:r>
+              <w:rPr>
+                <w:rFonts w:eastAsia="Calibri" w:cs=""/>
+                <w:b/>
+                <w:kern w:val="0"/>
+                <w:sz w:val="22"/>
+                <w:szCs w:val="22"/>
+                <w:lang w:val="pl-PL" w:eastAsia="en-US" w:bidi="ar-SA"/>
+              </w:rPr>
+              <w:t>Uwagi</w:t>
+            </w:r>
+          </w:p>
+          <w:p>
+            <w:pPr>
+              <w:pStyle w:val="Normal"/>
+              <w:widowControl/>
+              <w:suppressAutoHyphens w:val="true"/>
+              <w:spacing w:lineRule="auto" w:line="240" w:before="0" w:after="0"/>
+              <w:jc w:val="left"/>
+              <w:rPr>
+                <w:sz w:val="20"/>
+              </w:rPr>
+            </w:pPr>
+            <w:r>
+              <w:rPr>
+                <w:rFonts w:eastAsia="Calibri" w:cs=""/>
+                <w:kern w:val="0"/>
+                <w:sz w:val="14"/>
+                <w:szCs w:val="22"/>
+                <w:lang w:val="pl-PL" w:eastAsia="en-US" w:bidi="ar-SA"/>
+              </w:rPr>
+              <w:t>(problemy, przygotowanie, poziomu realizacji)</w:t>
+            </w:r>
+          </w:p>
+        </w:tc>
+        <w:tc>
+          <w:tcPr>
+            <w:tcW w:w="6097" w:type="dxa"/>
+            <w:tcBorders/>
+          </w:tcPr>
+          <w:p>
+            <w:pPr>
+              <w:pStyle w:val="Normal"/>
+              <w:widowControl/>
+              <w:suppressAutoHyphens w:val="true"/>
+              <w:spacing w:lineRule="auto" w:line="240" w:before="0" w:after="0"/>
+              <w:jc w:val="left"/>
+              <w:rPr>
                 <w:i/>
               </w:rPr>
             </w:pPr>
@@ -2925,18 +2970,22 @@
                 <w:szCs w:val="22"/>
                 <w:lang w:val="pl-PL" w:eastAsia="en-US" w:bidi="ar-SA"/>
               </w:rPr>
-              <w:t>Uwagi</w:t>
-            </w:r>
-          </w:p>
-          <w:p>
-            <w:pPr>
-              <w:pStyle w:val="Normal"/>
-              <w:widowControl/>
-              <w:suppressAutoHyphens w:val="true"/>
-              <w:spacing w:lineRule="auto" w:line="240" w:before="0" w:after="0"/>
-              <w:jc w:val="left"/>
-              <w:rPr>
-                <w:sz w:val="20"/>
+              <w:t>Inne zadania wynikające z realizacji projektu zrealizowane przez studenta</w:t>
+            </w:r>
+          </w:p>
+          <w:p>
+            <w:pPr>
+              <w:pStyle w:val="Normal"/>
+              <w:widowControl/>
+              <w:suppressAutoHyphens w:val="true"/>
+              <w:spacing w:lineRule="auto" w:line="240" w:before="0" w:after="0"/>
+              <w:jc w:val="left"/>
+              <w:rPr>
+                <w:rFonts w:ascii="Calibri" w:hAnsi="Calibri" w:eastAsia="Calibri" w:cs=""/>
+                <w:kern w:val="0"/>
+                <w:sz w:val="22"/>
+                <w:szCs w:val="22"/>
+                <w:lang w:val="pl-PL" w:eastAsia="en-US" w:bidi="ar-SA"/>
               </w:rPr>
             </w:pPr>
             <w:r>
@@ -2947,107 +2996,23 @@
                 <w:szCs w:val="22"/>
                 <w:lang w:val="pl-PL" w:eastAsia="en-US" w:bidi="ar-SA"/>
               </w:rPr>
-              <w:t>(problemy, przygotowanie, poziomu realizacji)</w:t>
-            </w:r>
-          </w:p>
-        </w:tc>
-        <w:tc>
-          <w:tcPr>
-            <w:tcW w:w="6096" w:type="dxa"/>
-            <w:tcBorders/>
-          </w:tcPr>
-          <w:p>
-            <w:pPr>
-              <w:pStyle w:val="Normal"/>
-              <w:widowControl/>
-              <w:suppressAutoHyphens w:val="true"/>
-              <w:spacing w:lineRule="auto" w:line="240" w:before="0" w:after="0"/>
-              <w:jc w:val="left"/>
-              <w:rPr>
-                <w:i/>
-                <w:i/>
-              </w:rPr>
-            </w:pPr>
-            <w:r>
-              <w:rPr>
-                <w:i/>
-              </w:rPr>
-            </w:r>
-          </w:p>
-        </w:tc>
-      </w:tr>
-      <w:tr>
-        <w:trPr/>
-        <w:tc>
-          <w:tcPr>
-            <w:tcW w:w="2965" w:type="dxa"/>
-            <w:tcBorders/>
-            <w:shd w:color="auto" w:fill="D9D9D9" w:themeFill="background1" w:themeFillShade="d9" w:val="clear"/>
-          </w:tcPr>
-          <w:p>
-            <w:pPr>
-              <w:pStyle w:val="Normal"/>
-              <w:widowControl/>
-              <w:suppressAutoHyphens w:val="true"/>
-              <w:spacing w:lineRule="auto" w:line="240" w:before="0" w:after="0"/>
-              <w:jc w:val="left"/>
-              <w:rPr>
-                <w:b/>
-              </w:rPr>
-            </w:pPr>
-            <w:r>
-              <w:rPr>
-                <w:rFonts w:eastAsia="Calibri" w:cs=""/>
-                <w:b/>
-                <w:kern w:val="0"/>
-                <w:sz w:val="22"/>
-                <w:szCs w:val="22"/>
-                <w:lang w:val="pl-PL" w:eastAsia="en-US" w:bidi="ar-SA"/>
-              </w:rPr>
-              <w:t>Inne zadania wynikające z realizacji projektu zrealizowane przez studenta</w:t>
-            </w:r>
-          </w:p>
-          <w:p>
-            <w:pPr>
-              <w:pStyle w:val="Normal"/>
-              <w:widowControl/>
-              <w:suppressAutoHyphens w:val="true"/>
-              <w:spacing w:lineRule="auto" w:line="240" w:before="0" w:after="0"/>
-              <w:jc w:val="left"/>
-              <w:rPr>
-                <w:rFonts w:ascii="Calibri" w:hAnsi="Calibri" w:eastAsia="Calibri" w:cs=""/>
-                <w:kern w:val="0"/>
-                <w:sz w:val="22"/>
-                <w:szCs w:val="22"/>
-                <w:lang w:val="pl-PL" w:eastAsia="en-US" w:bidi="ar-SA"/>
-              </w:rPr>
-            </w:pPr>
-            <w:r>
-              <w:rPr>
-                <w:rFonts w:eastAsia="Calibri" w:cs=""/>
-                <w:kern w:val="0"/>
-                <w:sz w:val="14"/>
-                <w:szCs w:val="22"/>
-                <w:lang w:val="pl-PL" w:eastAsia="en-US" w:bidi="ar-SA"/>
-              </w:rPr>
               <w:t>(np. przygotowanie prezentacji z realizacji etapu prac, referowanie, wystąpienie końcowe, itp.)</w:t>
             </w:r>
           </w:p>
         </w:tc>
         <w:tc>
           <w:tcPr>
-            <w:tcW w:w="6096" w:type="dxa"/>
-            <w:tcBorders/>
-          </w:tcPr>
-          <w:p>
-            <w:pPr>
-              <w:pStyle w:val="Normal"/>
-              <w:widowControl/>
-              <w:suppressAutoHyphens w:val="true"/>
-              <w:spacing w:lineRule="auto" w:line="240" w:before="0" w:after="0"/>
-              <w:jc w:val="left"/>
-              <w:rPr>
-                <w:i/>
+            <w:tcW w:w="6097" w:type="dxa"/>
+            <w:tcBorders/>
+          </w:tcPr>
+          <w:p>
+            <w:pPr>
+              <w:pStyle w:val="Normal"/>
+              <w:widowControl/>
+              <w:suppressAutoHyphens w:val="true"/>
+              <w:spacing w:lineRule="auto" w:line="240" w:before="0" w:after="0"/>
+              <w:jc w:val="left"/>
+              <w:rPr>
                 <w:i/>
               </w:rPr>
             </w:pPr>
@@ -3122,7 +3087,7 @@
 </file>
 
 <file path=word/footer1.xml><?xml version="1.0" encoding="utf-8"?>
-<w:ftr xmlns:o="urn:schemas-microsoft-com:office:office" xmlns:r="http://schemas.openxmlformats.org/officeDocument/2006/relationships" xmlns:v="urn:schemas-microsoft-com:vml" xmlns:w="http://schemas.openxmlformats.org/wordprocessingml/2006/main" xmlns:w10="urn:schemas-microsoft-com:office:word" xmlns:wp="http://schemas.openxmlformats.org/drawingml/2006/wordprocessingDrawing" xmlns:wps="http://schemas.microsoft.com/office/word/2010/wordprocessingShape" xmlns:wpg="http://schemas.microsoft.com/office/word/2010/wordprocessingGroup" xmlns:mc="http://schemas.openxmlformats.org/markup-compatibility/2006" xmlns:wp14="http://schemas.microsoft.com/office/word/2010/wordprocessingDrawing" xmlns:w14="http://schemas.microsoft.com/office/word/2010/wordml" xmlns:w15="http://schemas.microsoft.com/office/word/2012/wordml" mc:Ignorable="w14 wp14 w15">
+<w:ftr xmlns:o="urn:schemas-microsoft-com:office:office" xmlns:r="http://schemas.openxmlformats.org/officeDocument/2006/relationships" xmlns:v="urn:schemas-microsoft-com:vml" xmlns:w="http://schemas.openxmlformats.org/wordprocessingml/2006/main" xmlns:w10="urn:schemas-microsoft-com:office:word" xmlns:wp="http://schemas.openxmlformats.org/drawingml/2006/wordprocessingDrawing" xmlns:pic="http://schemas.openxmlformats.org/drawingml/2006/picture" xmlns:wps="http://schemas.microsoft.com/office/word/2010/wordprocessingShape" xmlns:wpg="http://schemas.microsoft.com/office/word/2010/wordprocessingGroup" xmlns:mc="http://schemas.openxmlformats.org/markup-compatibility/2006" xmlns:wp14="http://schemas.microsoft.com/office/word/2010/wordprocessingDrawing" xmlns:w14="http://schemas.microsoft.com/office/word/2010/wordml" xmlns:w15="http://schemas.microsoft.com/office/word/2012/wordml" mc:Ignorable="w14 wp14 w15">
   <w:p>
     <w:pPr>
       <w:pStyle w:val="Footer"/>
@@ -3136,16 +3101,16 @@
 </file>
 
 <file path=word/footer2.xml><?xml version="1.0" encoding="utf-8"?>
-<w:ftr xmlns:o="urn:schemas-microsoft-com:office:office" xmlns:r="http://schemas.openxmlformats.org/officeDocument/2006/relationships" xmlns:v="urn:schemas-microsoft-com:vml" xmlns:w="http://schemas.openxmlformats.org/wordprocessingml/2006/main" xmlns:w10="urn:schemas-microsoft-com:office:word" xmlns:wp="http://schemas.openxmlformats.org/drawingml/2006/wordprocessingDrawing" xmlns:wps="http://schemas.microsoft.com/office/word/2010/wordprocessingShape" xmlns:wpg="http://schemas.microsoft.com/office/word/2010/wordprocessingGroup" xmlns:mc="http://schemas.openxmlformats.org/markup-compatibility/2006" xmlns:wp14="http://schemas.microsoft.com/office/word/2010/wordprocessingDrawing" xmlns:w14="http://schemas.microsoft.com/office/word/2010/wordml" xmlns:w15="http://schemas.microsoft.com/office/word/2012/wordml" mc:Ignorable="w14 wp14 w15">
+<w:ftr xmlns:o="urn:schemas-microsoft-com:office:office" xmlns:r="http://schemas.openxmlformats.org/officeDocument/2006/relationships" xmlns:v="urn:schemas-microsoft-com:vml" xmlns:w="http://schemas.openxmlformats.org/wordprocessingml/2006/main" xmlns:w10="urn:schemas-microsoft-com:office:word" xmlns:wp="http://schemas.openxmlformats.org/drawingml/2006/wordprocessingDrawing" xmlns:pic="http://schemas.openxmlformats.org/drawingml/2006/picture" xmlns:wps="http://schemas.microsoft.com/office/word/2010/wordprocessingShape" xmlns:wpg="http://schemas.microsoft.com/office/word/2010/wordprocessingGroup" xmlns:mc="http://schemas.openxmlformats.org/markup-compatibility/2006" xmlns:wp14="http://schemas.microsoft.com/office/word/2010/wordprocessingDrawing" xmlns:w14="http://schemas.microsoft.com/office/word/2010/wordml" xmlns:w15="http://schemas.microsoft.com/office/word/2012/wordml" mc:Ignorable="w14 wp14 w15">
   <w:sdt>
     <w:sdtPr>
+      <w:id w:val="-1769616900"/>
       <w:docPartObj>
         <w:docPartGallery w:val="Page Numbers (Bottom of Page)"/>
         <w:docPartUnique w:val="true"/>
         <w:docPartGallery w:val="Page Numbers (Top of Page)"/>
         <w:docPartUnique w:val="true"/>
       </w:docPartObj>
-      <w:id w:val="-1769616900"/>
     </w:sdtPr>
     <w:sdtContent>
       <w:p>
@@ -3169,37 +3134,37 @@
         </w:r>
         <w:r>
           <w:rPr>
+            <w:b/>
+            <w:bCs/>
             <w:sz w:val="24"/>
-            <w:b/>
             <w:szCs w:val="24"/>
-            <w:bCs/>
           </w:rPr>
           <w:instrText xml:space="preserve"> PAGE </w:instrText>
         </w:r>
         <w:r>
           <w:rPr>
+            <w:b/>
+            <w:bCs/>
             <w:sz w:val="24"/>
-            <w:b/>
             <w:szCs w:val="24"/>
-            <w:bCs/>
           </w:rPr>
           <w:fldChar w:fldCharType="separate"/>
         </w:r>
         <w:r>
           <w:rPr>
+            <w:b/>
+            <w:bCs/>
             <w:sz w:val="24"/>
-            <w:b/>
             <w:szCs w:val="24"/>
-            <w:bCs/>
           </w:rPr>
           <w:t>2</w:t>
         </w:r>
         <w:r>
           <w:rPr>
+            <w:b/>
+            <w:bCs/>
             <w:sz w:val="24"/>
-            <w:b/>
             <w:szCs w:val="24"/>
-            <w:bCs/>
           </w:rPr>
           <w:fldChar w:fldCharType="end"/>
         </w:r>
@@ -3218,37 +3183,37 @@
         </w:r>
         <w:r>
           <w:rPr>
+            <w:b/>
+            <w:bCs/>
             <w:sz w:val="24"/>
-            <w:b/>
             <w:szCs w:val="24"/>
-            <w:bCs/>
           </w:rPr>
           <w:instrText xml:space="preserve"> NUMPAGES </w:instrText>
         </w:r>
         <w:r>
           <w:rPr>
+            <w:b/>
+            <w:bCs/>
             <w:sz w:val="24"/>
-            <w:b/>
             <w:szCs w:val="24"/>
-            <w:bCs/>
           </w:rPr>
           <w:fldChar w:fldCharType="separate"/>
         </w:r>
         <w:r>
           <w:rPr>
+            <w:b/>
+            <w:bCs/>
             <w:sz w:val="24"/>
-            <w:b/>
             <w:szCs w:val="24"/>
-            <w:bCs/>
           </w:rPr>
           <w:t>2</w:t>
         </w:r>
         <w:r>
           <w:rPr>
+            <w:b/>
+            <w:bCs/>
             <w:sz w:val="24"/>
-            <w:b/>
             <w:szCs w:val="24"/>
-            <w:bCs/>
           </w:rPr>
           <w:fldChar w:fldCharType="end"/>
         </w:r>
@@ -3268,16 +3233,16 @@
 </file>
 
 <file path=word/footer3.xml><?xml version="1.0" encoding="utf-8"?>
-<w:ftr xmlns:o="urn:schemas-microsoft-com:office:office" xmlns:r="http://schemas.openxmlformats.org/officeDocument/2006/relationships" xmlns:v="urn:schemas-microsoft-com:vml" xmlns:w="http://schemas.openxmlformats.org/wordprocessingml/2006/main" xmlns:w10="urn:schemas-microsoft-com:office:word" xmlns:wp="http://schemas.openxmlformats.org/drawingml/2006/wordprocessingDrawing" xmlns:wps="http://schemas.microsoft.com/office/word/2010/wordprocessingShape" xmlns:wpg="http://schemas.microsoft.com/office/word/2010/wordprocessingGroup" xmlns:mc="http://schemas.openxmlformats.org/markup-compatibility/2006" xmlns:wp14="http://schemas.microsoft.com/office/word/2010/wordprocessingDrawing" xmlns:w14="http://schemas.microsoft.com/office/word/2010/wordml" xmlns:w15="http://schemas.microsoft.com/office/word/2012/wordml" mc:Ignorable="w14 wp14 w15">
+<w:ftr xmlns:o="urn:schemas-microsoft-com:office:office" xmlns:r="http://schemas.openxmlformats.org/officeDocument/2006/relationships" xmlns:v="urn:schemas-microsoft-com:vml" xmlns:w="http://schemas.openxmlformats.org/wordprocessingml/2006/main" xmlns:w10="urn:schemas-microsoft-com:office:word" xmlns:wp="http://schemas.openxmlformats.org/drawingml/2006/wordprocessingDrawing" xmlns:pic="http://schemas.openxmlformats.org/drawingml/2006/picture" xmlns:wps="http://schemas.microsoft.com/office/word/2010/wordprocessingShape" xmlns:wpg="http://schemas.microsoft.com/office/word/2010/wordprocessingGroup" xmlns:mc="http://schemas.openxmlformats.org/markup-compatibility/2006" xmlns:wp14="http://schemas.microsoft.com/office/word/2010/wordprocessingDrawing" xmlns:w14="http://schemas.microsoft.com/office/word/2010/wordml" xmlns:w15="http://schemas.microsoft.com/office/word/2012/wordml" mc:Ignorable="w14 wp14 w15">
   <w:sdt>
     <w:sdtPr>
+      <w:id w:val="-1769616900"/>
       <w:docPartObj>
         <w:docPartGallery w:val="Page Numbers (Bottom of Page)"/>
         <w:docPartUnique w:val="true"/>
         <w:docPartGallery w:val="Page Numbers (Top of Page)"/>
         <w:docPartUnique w:val="true"/>
       </w:docPartObj>
-      <w:id w:val="-1769616900"/>
     </w:sdtPr>
     <w:sdtContent>
       <w:p>
@@ -3301,37 +3266,37 @@
         </w:r>
         <w:r>
           <w:rPr>
+            <w:b/>
+            <w:bCs/>
             <w:sz w:val="24"/>
-            <w:b/>
             <w:szCs w:val="24"/>
-            <w:bCs/>
           </w:rPr>
           <w:instrText xml:space="preserve"> PAGE </w:instrText>
         </w:r>
         <w:r>
           <w:rPr>
+            <w:b/>
+            <w:bCs/>
             <w:sz w:val="24"/>
-            <w:b/>
             <w:szCs w:val="24"/>
-            <w:bCs/>
           </w:rPr>
           <w:fldChar w:fldCharType="separate"/>
         </w:r>
         <w:r>
           <w:rPr>
+            <w:b/>
+            <w:bCs/>
             <w:sz w:val="24"/>
-            <w:b/>
             <w:szCs w:val="24"/>
-            <w:bCs/>
           </w:rPr>
           <w:t>2</w:t>
         </w:r>
         <w:r>
           <w:rPr>
+            <w:b/>
+            <w:bCs/>
             <w:sz w:val="24"/>
-            <w:b/>
             <w:szCs w:val="24"/>
-            <w:bCs/>
           </w:rPr>
           <w:fldChar w:fldCharType="end"/>
         </w:r>
@@ -3350,37 +3315,37 @@
         </w:r>
         <w:r>
           <w:rPr>
+            <w:b/>
+            <w:bCs/>
             <w:sz w:val="24"/>
-            <w:b/>
             <w:szCs w:val="24"/>
-            <w:bCs/>
           </w:rPr>
           <w:instrText xml:space="preserve"> NUMPAGES </w:instrText>
         </w:r>
         <w:r>
           <w:rPr>
+            <w:b/>
+            <w:bCs/>
             <w:sz w:val="24"/>
-            <w:b/>
             <w:szCs w:val="24"/>
-            <w:bCs/>
           </w:rPr>
           <w:fldChar w:fldCharType="separate"/>
         </w:r>
         <w:r>
           <w:rPr>
+            <w:b/>
+            <w:bCs/>
             <w:sz w:val="24"/>
-            <w:b/>
             <w:szCs w:val="24"/>
-            <w:bCs/>
           </w:rPr>
           <w:t>2</w:t>
         </w:r>
         <w:r>
           <w:rPr>
+            <w:b/>
+            <w:bCs/>
             <w:sz w:val="24"/>
-            <w:b/>
             <w:szCs w:val="24"/>
-            <w:bCs/>
           </w:rPr>
           <w:fldChar w:fldCharType="end"/>
         </w:r>
@@ -3400,7 +3365,7 @@
 </file>
 
 <file path=word/header1.xml><?xml version="1.0" encoding="utf-8"?>
-<w:hdr xmlns:o="urn:schemas-microsoft-com:office:office" xmlns:r="http://schemas.openxmlformats.org/officeDocument/2006/relationships" xmlns:v="urn:schemas-microsoft-com:vml" xmlns:w="http://schemas.openxmlformats.org/wordprocessingml/2006/main" xmlns:w10="urn:schemas-microsoft-com:office:word" xmlns:wp="http://schemas.openxmlformats.org/drawingml/2006/wordprocessingDrawing" xmlns:wps="http://schemas.microsoft.com/office/word/2010/wordprocessingShape" xmlns:wpg="http://schemas.microsoft.com/office/word/2010/wordprocessingGroup" xmlns:mc="http://schemas.openxmlformats.org/markup-compatibility/2006" xmlns:wp14="http://schemas.microsoft.com/office/word/2010/wordprocessingDrawing" xmlns:w14="http://schemas.microsoft.com/office/word/2010/wordml" xmlns:w15="http://schemas.microsoft.com/office/word/2012/wordml" mc:Ignorable="w14 wp14 w15">
+<w:hdr xmlns:o="urn:schemas-microsoft-com:office:office" xmlns:r="http://schemas.openxmlformats.org/officeDocument/2006/relationships" xmlns:v="urn:schemas-microsoft-com:vml" xmlns:w="http://schemas.openxmlformats.org/wordprocessingml/2006/main" xmlns:w10="urn:schemas-microsoft-com:office:word" xmlns:wp="http://schemas.openxmlformats.org/drawingml/2006/wordprocessingDrawing" xmlns:pic="http://schemas.openxmlformats.org/drawingml/2006/picture" xmlns:wps="http://schemas.microsoft.com/office/word/2010/wordprocessingShape" xmlns:wpg="http://schemas.microsoft.com/office/word/2010/wordprocessingGroup" xmlns:mc="http://schemas.openxmlformats.org/markup-compatibility/2006" xmlns:wp14="http://schemas.microsoft.com/office/word/2010/wordprocessingDrawing" xmlns:w14="http://schemas.microsoft.com/office/word/2010/wordml" xmlns:w15="http://schemas.microsoft.com/office/word/2012/wordml" mc:Ignorable="w14 wp14 w15">
   <w:p>
     <w:pPr>
       <w:pStyle w:val="Header"/>
@@ -3414,7 +3379,7 @@
 </file>
 
 <file path=word/header2.xml><?xml version="1.0" encoding="utf-8"?>
-<w:hdr xmlns:o="urn:schemas-microsoft-com:office:office" xmlns:r="http://schemas.openxmlformats.org/officeDocument/2006/relationships" xmlns:v="urn:schemas-microsoft-com:vml" xmlns:w="http://schemas.openxmlformats.org/wordprocessingml/2006/main" xmlns:w10="urn:schemas-microsoft-com:office:word" xmlns:wp="http://schemas.openxmlformats.org/drawingml/2006/wordprocessingDrawing" xmlns:wps="http://schemas.microsoft.com/office/word/2010/wordprocessingShape" xmlns:wpg="http://schemas.microsoft.com/office/word/2010/wordprocessingGroup" xmlns:mc="http://schemas.openxmlformats.org/markup-compatibility/2006" xmlns:wp14="http://schemas.microsoft.com/office/word/2010/wordprocessingDrawing" xmlns:w14="http://schemas.microsoft.com/office/word/2010/wordml" xmlns:w15="http://schemas.microsoft.com/office/word/2012/wordml" mc:Ignorable="w14 wp14 w15">
+<w:hdr xmlns:o="urn:schemas-microsoft-com:office:office" xmlns:r="http://schemas.openxmlformats.org/officeDocument/2006/relationships" xmlns:v="urn:schemas-microsoft-com:vml" xmlns:w="http://schemas.openxmlformats.org/wordprocessingml/2006/main" xmlns:w10="urn:schemas-microsoft-com:office:word" xmlns:wp="http://schemas.openxmlformats.org/drawingml/2006/wordprocessingDrawing" xmlns:pic="http://schemas.openxmlformats.org/drawingml/2006/picture" xmlns:wps="http://schemas.microsoft.com/office/word/2010/wordprocessingShape" xmlns:wpg="http://schemas.microsoft.com/office/word/2010/wordprocessingGroup" xmlns:mc="http://schemas.openxmlformats.org/markup-compatibility/2006" xmlns:wp14="http://schemas.microsoft.com/office/word/2010/wordprocessingDrawing" xmlns:w14="http://schemas.microsoft.com/office/word/2010/wordml" xmlns:w15="http://schemas.microsoft.com/office/word/2012/wordml" mc:Ignorable="w14 wp14 w15">
   <w:p>
     <w:pPr>
       <w:pStyle w:val="Header"/>
@@ -3433,7 +3398,7 @@
 </file>
 
 <file path=word/header3.xml><?xml version="1.0" encoding="utf-8"?>
-<w:hdr xmlns:o="urn:schemas-microsoft-com:office:office" xmlns:r="http://schemas.openxmlformats.org/officeDocument/2006/relationships" xmlns:v="urn:schemas-microsoft-com:vml" xmlns:w="http://schemas.openxmlformats.org/wordprocessingml/2006/main" xmlns:w10="urn:schemas-microsoft-com:office:word" xmlns:wp="http://schemas.openxmlformats.org/drawingml/2006/wordprocessingDrawing" xmlns:wps="http://schemas.microsoft.com/office/word/2010/wordprocessingShape" xmlns:wpg="http://schemas.microsoft.com/office/word/2010/wordprocessingGroup" xmlns:mc="http://schemas.openxmlformats.org/markup-compatibility/2006" xmlns:wp14="http://schemas.microsoft.com/office/word/2010/wordprocessingDrawing" xmlns:w14="http://schemas.microsoft.com/office/word/2010/wordml" xmlns:w15="http://schemas.microsoft.com/office/word/2012/wordml" mc:Ignorable="w14 wp14 w15">
+<w:hdr xmlns:o="urn:schemas-microsoft-com:office:office" xmlns:r="http://schemas.openxmlformats.org/officeDocument/2006/relationships" xmlns:v="urn:schemas-microsoft-com:vml" xmlns:w="http://schemas.openxmlformats.org/wordprocessingml/2006/main" xmlns:w10="urn:schemas-microsoft-com:office:word" xmlns:wp="http://schemas.openxmlformats.org/drawingml/2006/wordprocessingDrawing" xmlns:pic="http://schemas.openxmlformats.org/drawingml/2006/picture" xmlns:wps="http://schemas.microsoft.com/office/word/2010/wordprocessingShape" xmlns:wpg="http://schemas.microsoft.com/office/word/2010/wordprocessingGroup" xmlns:mc="http://schemas.openxmlformats.org/markup-compatibility/2006" xmlns:wp14="http://schemas.microsoft.com/office/word/2010/wordprocessingDrawing" xmlns:w14="http://schemas.microsoft.com/office/word/2010/wordml" xmlns:w15="http://schemas.microsoft.com/office/word/2012/wordml" mc:Ignorable="w14 wp14 w15">
   <w:p>
     <w:pPr>
       <w:pStyle w:val="Header"/>
@@ -3866,8 +3831,8 @@
     </w:rPr>
   </w:style>
   <w:style w:type="paragraph" w:styleId="Heading1">
-    <w:name w:val="Heading 1"/>
-    <w:basedOn w:val="Nagwek"/>
+    <w:name w:val="heading 1"/>
+    <w:basedOn w:val="Nagwekuser"/>
     <w:next w:val="BodyText"/>
     <w:qFormat/>
     <w:pPr>
@@ -3951,7 +3916,7 @@
     </w:rPr>
   </w:style>
   <w:style w:type="paragraph" w:styleId="Caption">
-    <w:name w:val="Caption"/>
+    <w:name w:val="caption"/>
     <w:basedOn w:val="Normal"/>
     <w:qFormat/>
     <w:pPr>
@@ -3977,6 +3942,39 @@
       <w:rFonts w:cs="Arial"/>
     </w:rPr>
   </w:style>
+  <w:style w:type="paragraph" w:styleId="Nagwekuser">
+    <w:name w:val="Nagłówek (user)"/>
+    <w:basedOn w:val="Normal"/>
+    <w:next w:val="BodyText"/>
+    <w:qFormat/>
+    <w:pPr>
+      <w:keepNext w:val="true"/>
+      <w:spacing w:before="240" w:after="120"/>
+    </w:pPr>
+    <w:rPr>
+      <w:rFonts w:ascii="Liberation Sans" w:hAnsi="Liberation Sans" w:eastAsia="Microsoft YaHei" w:cs="Arial"/>
+      <w:sz w:val="28"/>
+      <w:szCs w:val="28"/>
+    </w:rPr>
+  </w:style>
+  <w:style w:type="paragraph" w:styleId="Indeksuser">
+    <w:name w:val="Indeks (user)"/>
+    <w:basedOn w:val="Normal"/>
+    <w:qFormat/>
+    <w:pPr>
+      <w:suppressLineNumbers/>
+    </w:pPr>
+    <w:rPr>
+      <w:rFonts w:cs="Arial"/>
+    </w:rPr>
+  </w:style>
+  <w:style w:type="paragraph" w:styleId="Gwkaistopkauser">
+    <w:name w:val="Główka i stopka (user)"/>
+    <w:basedOn w:val="Normal"/>
+    <w:qFormat/>
+    <w:pPr/>
+    <w:rPr/>
+  </w:style>
   <w:style w:type="paragraph" w:styleId="Gwkaistopka">
     <w:name w:val="Główka i stopka"/>
     <w:basedOn w:val="Normal"/>
@@ -3985,7 +3983,7 @@
     <w:rPr/>
   </w:style>
   <w:style w:type="paragraph" w:styleId="Header">
-    <w:name w:val="Header"/>
+    <w:name w:val="header"/>
     <w:basedOn w:val="Normal"/>
     <w:link w:val="NagwekZnak"/>
     <w:uiPriority w:val="99"/>
@@ -4002,7 +4000,7 @@
     <w:rPr/>
   </w:style>
   <w:style w:type="paragraph" w:styleId="Footer">
-    <w:name w:val="Footer"/>
+    <w:name w:val="footer"/>
     <w:basedOn w:val="Normal"/>
     <w:link w:val="StopkaZnak"/>
     <w:uiPriority w:val="99"/>
@@ -4039,8 +4037,8 @@
       <w:lang w:val="pl-PL" w:eastAsia="en-US" w:bidi="ar-SA"/>
     </w:rPr>
   </w:style>
-  <w:style w:type="numbering" w:styleId="Bezlisty" w:default="1">
-    <w:name w:val="Bez listy"/>
+  <w:style w:type="numbering" w:styleId="Bezlistyuser" w:default="1">
+    <w:name w:val="Bez listy (user)"/>
     <w:uiPriority w:val="99"/>
     <w:semiHidden/>
     <w:unhideWhenUsed/>
@@ -4090,37 +4088,37 @@
         <a:srgbClr val="000000"/>
       </a:dk1>
       <a:lt1>
-        <a:srgbClr val="ffffff"/>
+        <a:srgbClr val="FFFFFF"/>
       </a:lt1>
       <a:dk2>
-        <a:srgbClr val="44546a"/>
+        <a:srgbClr val="44546A"/>
       </a:dk2>
       <a:lt2>
-        <a:srgbClr val="e7e6e6"/>
+        <a:srgbClr val="E7E6E6"/>
       </a:lt2>
       <a:accent1>
-        <a:srgbClr val="4472c4"/>
+        <a:srgbClr val="4472C4"/>
       </a:accent1>
       <a:accent2>
-        <a:srgbClr val="ed7d31"/>
+        <a:srgbClr val="ED7D31"/>
       </a:accent2>
       <a:accent3>
-        <a:srgbClr val="a5a5a5"/>
+        <a:srgbClr val="A5A5A5"/>
       </a:accent3>
       <a:accent4>
-        <a:srgbClr val="ffc000"/>
+        <a:srgbClr val="FFC000"/>
       </a:accent4>
       <a:accent5>
-        <a:srgbClr val="5b9bd5"/>
+        <a:srgbClr val="5B9BD5"/>
       </a:accent5>
       <a:accent6>
-        <a:srgbClr val="70ad47"/>
+        <a:srgbClr val="70AD47"/>
       </a:accent6>
       <a:hlink>
-        <a:srgbClr val="0563c1"/>
+        <a:srgbClr val="0563C1"/>
       </a:hlink>
       <a:folHlink>
-        <a:srgbClr val="954f72"/>
+        <a:srgbClr val="954F72"/>
       </a:folHlink>
     </a:clrScheme>
     <a:fontScheme name="Pakiet Office">

</xml_diff>